<commit_message>
Semi complete scenes and skyboxes, main menu done, along side player
</commit_message>
<xml_diff>
--- a/Assets/Documentation/AGENT INFO GAME DOCUMENTATION.docx
+++ b/Assets/Documentation/AGENT INFO GAME DOCUMENTATION.docx
@@ -299,6 +299,342 @@
     </w:p>
     <w:p>
       <w:pPr>
+        <w:numPr>
+          <w:ilvl w:val="0"/>
+          <w:numId w:val="0"/>
+        </w:numPr>
+        <w:jc w:val="left"/>
+        <w:rPr>
+          <w:rFonts w:hint="default" w:ascii="Bahnschrift" w:hAnsi="Bahnschrift" w:cs="Bahnschrift"/>
+          <w:lang w:val="en-US"/>
+        </w:rPr>
+      </w:pPr>
+    </w:p>
+    <w:p>
+      <w:pPr>
+        <w:numPr>
+          <w:ilvl w:val="0"/>
+          <w:numId w:val="0"/>
+        </w:numPr>
+        <w:jc w:val="both"/>
+        <w:rPr>
+          <w:rFonts w:hint="default" w:ascii="Bahnschrift" w:hAnsi="Bahnschrift" w:cs="Bahnschrift"/>
+          <w:lang w:val="en-US"/>
+        </w:rPr>
+      </w:pPr>
+    </w:p>
+    <w:p>
+      <w:pPr>
+        <w:numPr>
+          <w:ilvl w:val="0"/>
+          <w:numId w:val="0"/>
+        </w:numPr>
+        <w:jc w:val="both"/>
+        <w:rPr>
+          <w:rFonts w:hint="default" w:ascii="ARCO Typography" w:hAnsi="ARCO Typography" w:cs="ARCO Typography"/>
+          <w:sz w:val="32"/>
+          <w:szCs w:val="32"/>
+          <w:lang w:val="en-US"/>
+        </w:rPr>
+      </w:pPr>
+      <w:r>
+        <w:rPr>
+          <w:rFonts w:hint="default" w:ascii="ARCO Typography" w:hAnsi="ARCO Typography" w:cs="ARCO Typography"/>
+          <w:sz w:val="32"/>
+          <w:szCs w:val="32"/>
+          <w:lang w:val="en-US"/>
+        </w:rPr>
+        <w:t>ENEMIES:</w:t>
+      </w:r>
+    </w:p>
+    <w:p>
+      <w:pPr>
+        <w:numPr>
+          <w:ilvl w:val="0"/>
+          <w:numId w:val="0"/>
+        </w:numPr>
+        <w:jc w:val="both"/>
+        <w:rPr>
+          <w:rFonts w:hint="default" w:ascii="Bahnschrift" w:hAnsi="Bahnschrift" w:cs="Bahnschrift"/>
+          <w:lang w:val="en-US"/>
+        </w:rPr>
+      </w:pPr>
+      <w:r>
+        <w:rPr>
+          <w:rFonts w:hint="default" w:ascii="Bahnschrift" w:hAnsi="Bahnschrift" w:cs="Bahnschrift"/>
+          <w:lang w:val="en-US"/>
+        </w:rPr>
+        <w:t>Classes of enemies: Ranged shooters, Kamikazie Enemies, Melle/Close Combat enemies.</w:t>
+      </w:r>
+    </w:p>
+    <w:p>
+      <w:pPr>
+        <w:numPr>
+          <w:ilvl w:val="0"/>
+          <w:numId w:val="0"/>
+        </w:numPr>
+        <w:jc w:val="both"/>
+        <w:rPr>
+          <w:rFonts w:hint="default" w:ascii="Bahnschrift" w:hAnsi="Bahnschrift" w:cs="Bahnschrift"/>
+          <w:lang w:val="en-US"/>
+        </w:rPr>
+      </w:pPr>
+      <w:r>
+        <w:rPr>
+          <w:rFonts w:hint="default" w:ascii="Bahnschrift" w:hAnsi="Bahnschrift" w:cs="Bahnschrift"/>
+          <w:lang w:val="en-US"/>
+        </w:rPr>
+        <w:t>Enemy types:</w:t>
+      </w:r>
+    </w:p>
+    <w:p>
+      <w:pPr>
+        <w:numPr>
+          <w:ilvl w:val="0"/>
+          <w:numId w:val="0"/>
+        </w:numPr>
+        <w:jc w:val="both"/>
+        <w:rPr>
+          <w:rFonts w:hint="default" w:ascii="Bahnschrift" w:hAnsi="Bahnschrift" w:cs="Bahnschrift"/>
+          <w:lang w:val="en-US"/>
+        </w:rPr>
+      </w:pPr>
+      <w:r>
+        <w:rPr>
+          <w:rFonts w:hint="default" w:ascii="Bahnschrift" w:hAnsi="Bahnschrift" w:cs="Bahnschrift"/>
+          <w:lang w:val="en-US"/>
+        </w:rPr>
+        <w:t>Bots: close combat</w:t>
+      </w:r>
+    </w:p>
+    <w:p>
+      <w:pPr>
+        <w:numPr>
+          <w:ilvl w:val="0"/>
+          <w:numId w:val="0"/>
+        </w:numPr>
+        <w:jc w:val="both"/>
+        <w:rPr>
+          <w:rFonts w:hint="default" w:ascii="Bahnschrift" w:hAnsi="Bahnschrift" w:cs="Bahnschrift"/>
+          <w:lang w:val="en-US"/>
+        </w:rPr>
+      </w:pPr>
+      <w:r>
+        <w:rPr>
+          <w:rFonts w:hint="default" w:ascii="Bahnschrift" w:hAnsi="Bahnschrift" w:cs="Bahnschrift"/>
+          <w:lang w:val="en-US"/>
+        </w:rPr>
+        <w:t>Turrets: ranged shooters</w:t>
+      </w:r>
+    </w:p>
+    <w:p>
+      <w:pPr>
+        <w:numPr>
+          <w:ilvl w:val="0"/>
+          <w:numId w:val="0"/>
+        </w:numPr>
+        <w:jc w:val="both"/>
+        <w:rPr>
+          <w:rFonts w:hint="default" w:ascii="Bahnschrift" w:hAnsi="Bahnschrift" w:cs="Bahnschrift"/>
+          <w:lang w:val="en-US"/>
+        </w:rPr>
+      </w:pPr>
+      <w:r>
+        <w:rPr>
+          <w:rFonts w:hint="default" w:ascii="Bahnschrift" w:hAnsi="Bahnschrift" w:cs="Bahnschrift"/>
+          <w:lang w:val="en-US"/>
+        </w:rPr>
+        <w:t>Turret bots: ranged shooters with chase ability</w:t>
+      </w:r>
+    </w:p>
+    <w:p>
+      <w:pPr>
+        <w:numPr>
+          <w:ilvl w:val="0"/>
+          <w:numId w:val="0"/>
+        </w:numPr>
+        <w:jc w:val="both"/>
+        <w:rPr>
+          <w:rFonts w:hint="default" w:ascii="Bahnschrift" w:hAnsi="Bahnschrift" w:cs="Bahnschrift"/>
+          <w:lang w:val="en-US"/>
+        </w:rPr>
+      </w:pPr>
+      <w:r>
+        <w:rPr>
+          <w:rFonts w:hint="default" w:ascii="Bahnschrift" w:hAnsi="Bahnschrift" w:cs="Bahnschrift"/>
+          <w:lang w:val="en-US"/>
+        </w:rPr>
+        <w:t>Trolls: melle/close combat enemies</w:t>
+      </w:r>
+    </w:p>
+    <w:p>
+      <w:pPr>
+        <w:numPr>
+          <w:ilvl w:val="0"/>
+          <w:numId w:val="0"/>
+        </w:numPr>
+        <w:jc w:val="both"/>
+        <w:rPr>
+          <w:rFonts w:hint="default" w:ascii="Bahnschrift" w:hAnsi="Bahnschrift" w:cs="Bahnschrift"/>
+          <w:lang w:val="en-US"/>
+        </w:rPr>
+      </w:pPr>
+      <w:r>
+        <w:rPr>
+          <w:rFonts w:hint="default" w:ascii="Bahnschrift" w:hAnsi="Bahnschrift" w:cs="Bahnschrift"/>
+          <w:lang w:val="en-US"/>
+        </w:rPr>
+        <w:t xml:space="preserve">TinyMushroomType enemies: </w:t>
+      </w:r>
+      <w:bookmarkStart w:id="0" w:name="_GoBack"/>
+      <w:bookmarkEnd w:id="0"/>
+      <w:r>
+        <w:rPr>
+          <w:rFonts w:hint="default" w:ascii="Bahnschrift" w:hAnsi="Bahnschrift" w:cs="Bahnschrift"/>
+          <w:lang w:val="en-US"/>
+        </w:rPr>
+        <w:t xml:space="preserve">kamikazie </w:t>
+      </w:r>
+    </w:p>
+    <w:p>
+      <w:pPr>
+        <w:numPr>
+          <w:ilvl w:val="0"/>
+          <w:numId w:val="0"/>
+        </w:numPr>
+        <w:jc w:val="both"/>
+        <w:rPr>
+          <w:rFonts w:hint="default" w:ascii="Bahnschrift" w:hAnsi="Bahnschrift" w:cs="Bahnschrift"/>
+          <w:lang w:val="en-US"/>
+        </w:rPr>
+      </w:pPr>
+      <w:r>
+        <w:rPr>
+          <w:rFonts w:hint="default" w:ascii="Bahnschrift" w:hAnsi="Bahnschrift" w:cs="Bahnschrift"/>
+          <w:lang w:val="en-US"/>
+        </w:rPr>
+        <w:t>Bomb bots enemies: kamikazie</w:t>
+      </w:r>
+    </w:p>
+    <w:p>
+      <w:pPr>
+        <w:numPr>
+          <w:ilvl w:val="0"/>
+          <w:numId w:val="0"/>
+        </w:numPr>
+        <w:jc w:val="both"/>
+        <w:rPr>
+          <w:rFonts w:hint="default" w:ascii="Bahnschrift" w:hAnsi="Bahnschrift" w:cs="Bahnschrift"/>
+          <w:lang w:val="en-US"/>
+        </w:rPr>
+      </w:pPr>
+    </w:p>
+    <w:p>
+      <w:pPr>
+        <w:numPr>
+          <w:ilvl w:val="0"/>
+          <w:numId w:val="0"/>
+        </w:numPr>
+        <w:jc w:val="both"/>
+        <w:rPr>
+          <w:rFonts w:hint="default" w:ascii="ARCO Typography" w:hAnsi="ARCO Typography" w:cs="ARCO Typography"/>
+          <w:sz w:val="32"/>
+          <w:szCs w:val="32"/>
+          <w:lang w:val="en-US"/>
+        </w:rPr>
+      </w:pPr>
+      <w:r>
+        <w:rPr>
+          <w:rFonts w:hint="default" w:ascii="ARCO Typography" w:hAnsi="ARCO Typography" w:cs="ARCO Typography"/>
+          <w:sz w:val="32"/>
+          <w:szCs w:val="32"/>
+          <w:lang w:val="en-US"/>
+        </w:rPr>
+        <w:t>NPC:</w:t>
+      </w:r>
+    </w:p>
+    <w:p>
+      <w:pPr>
+        <w:numPr>
+          <w:ilvl w:val="0"/>
+          <w:numId w:val="0"/>
+        </w:numPr>
+        <w:jc w:val="both"/>
+        <w:rPr>
+          <w:rFonts w:hint="default" w:ascii="Bahnschrift" w:hAnsi="Bahnschrift" w:cs="Bahnschrift"/>
+          <w:lang w:val="en-US"/>
+        </w:rPr>
+      </w:pPr>
+      <w:r>
+        <w:rPr>
+          <w:rFonts w:hint="default" w:ascii="Bahnschrift" w:hAnsi="Bahnschrift" w:cs="Bahnschrift"/>
+          <w:lang w:val="en-US"/>
+        </w:rPr>
+        <w:t>Types of NPC’s: Static and Moving</w:t>
+      </w:r>
+    </w:p>
+    <w:p>
+      <w:pPr>
+        <w:numPr>
+          <w:ilvl w:val="0"/>
+          <w:numId w:val="0"/>
+        </w:numPr>
+        <w:jc w:val="both"/>
+        <w:rPr>
+          <w:rFonts w:hint="default" w:ascii="Bahnschrift" w:hAnsi="Bahnschrift" w:cs="Bahnschrift"/>
+          <w:lang w:val="en-US"/>
+        </w:rPr>
+      </w:pPr>
+      <w:r>
+        <w:rPr>
+          <w:rFonts w:hint="default" w:ascii="Bahnschrift" w:hAnsi="Bahnschrift" w:cs="Bahnschrift"/>
+          <w:lang w:val="en-US"/>
+        </w:rPr>
+        <w:t>Static enemies just stay at a set place, Moving enemies move around the map. But stop movi ng once interacted with and when finished talin the continue walking.</w:t>
+      </w:r>
+    </w:p>
+    <w:p>
+      <w:pPr>
+        <w:numPr>
+          <w:ilvl w:val="0"/>
+          <w:numId w:val="0"/>
+        </w:numPr>
+        <w:jc w:val="both"/>
+        <w:rPr>
+          <w:rFonts w:hint="default" w:ascii="Bahnschrift" w:hAnsi="Bahnschrift" w:cs="Bahnschrift"/>
+          <w:lang w:val="en-US"/>
+        </w:rPr>
+      </w:pPr>
+      <w:r>
+        <w:rPr>
+          <w:rFonts w:hint="default" w:ascii="Bahnschrift" w:hAnsi="Bahnschrift" w:cs="Bahnschrift"/>
+          <w:lang w:val="en-US"/>
+        </w:rPr>
+        <w:t>The NPC’s the player will talk to are all Static.</w:t>
+      </w:r>
+    </w:p>
+    <w:p>
+      <w:pPr>
+        <w:numPr>
+          <w:ilvl w:val="0"/>
+          <w:numId w:val="0"/>
+        </w:numPr>
+        <w:jc w:val="both"/>
+        <w:rPr>
+          <w:rFonts w:hint="default" w:ascii="Bahnschrift" w:hAnsi="Bahnschrift" w:cs="Bahnschrift"/>
+          <w:lang w:val="en-US"/>
+        </w:rPr>
+      </w:pPr>
+      <w:r>
+        <w:rPr>
+          <w:rFonts w:hint="default" w:ascii="Bahnschrift" w:hAnsi="Bahnschrift" w:cs="Bahnschrift"/>
+          <w:lang w:val="en-US"/>
+        </w:rPr>
+        <w:t>The npc’s and enemy movement logic vary drastically.</w:t>
+      </w:r>
+    </w:p>
+    <w:p>
+      <w:pPr>
         <w:pStyle w:val="4"/>
         <w:bidi w:val="0"/>
         <w:spacing w:line="240" w:lineRule="auto"/>
@@ -893,16 +1229,7 @@
           <w:rFonts w:hint="default" w:ascii="Bahnschrift" w:hAnsi="Bahnschrift" w:cs="Bahnschrift"/>
           <w:lang w:val="en-US"/>
         </w:rPr>
-        <w:t>[</w:t>
-      </w:r>
-      <w:bookmarkStart w:id="0" w:name="_GoBack"/>
-      <w:bookmarkEnd w:id="0"/>
-      <w:r>
-        <w:rPr>
-          <w:rFonts w:hint="default" w:ascii="Bahnschrift" w:hAnsi="Bahnschrift" w:cs="Bahnschrift"/>
-          <w:lang w:val="en-US"/>
-        </w:rPr>
-        <w:t>Between Player and the Chief of the agency]</w:t>
+        <w:t>[Between Player and the Chief of the agency]</w:t>
       </w:r>
     </w:p>
     <w:p>
@@ -1488,7 +1815,7 @@
           <w:bCs/>
           <w:lang w:val="en-US"/>
         </w:rPr>
-        <w:t>Introduction/tutorial level</w:t>
+        <w:t>Introduction/tutorial level (Training-Ground)</w:t>
       </w:r>
     </w:p>
     <w:p>
@@ -2361,6 +2688,7 @@
         <w:textAlignment w:val="auto"/>
         <w:rPr>
           <w:rFonts w:hint="default" w:ascii="Bahnschrift" w:hAnsi="Bahnschrift" w:cs="Bahnschrift"/>
+          <w:lang w:val="en-US"/>
         </w:rPr>
       </w:pPr>
       <w:r>
@@ -2380,7 +2708,7 @@
           <w:bCs/>
           <w:lang w:val="en-US"/>
         </w:rPr>
-        <w:t xml:space="preserve"> </w:t>
+        <w:t xml:space="preserve"> The campaign</w:t>
       </w:r>
     </w:p>
     <w:p>
@@ -2470,7 +2798,7 @@
           <w:rFonts w:hint="default" w:ascii="Bahnschrift" w:hAnsi="Bahnschrift" w:cs="Bahnschrift"/>
           <w:lang w:val="en-US"/>
         </w:rPr>
-        <w:t xml:space="preserve"> </w:t>
+        <w:t xml:space="preserve"> in a crowd locate and arrest/defeat agents of the mayor that have been sent to spread disinformation in a campain ground, find clues for locating the teleporter back home</w:t>
       </w:r>
     </w:p>
     <w:p>
@@ -2548,6 +2876,13 @@
         </w:rPr>
         <w:t xml:space="preserve"> </w:t>
       </w:r>
+      <w:r>
+        <w:rPr>
+          <w:rFonts w:hint="default" w:ascii="Bahnschrift" w:hAnsi="Bahnschrift" w:cs="Bahnschrift"/>
+          <w:lang w:val="en-US"/>
+        </w:rPr>
+        <w:t>sneak and find the agents of the mayor and arrestthem</w:t>
+      </w:r>
     </w:p>
     <w:p>
       <w:pPr>
@@ -2588,6 +2923,13 @@
           <w:rFonts w:hint="default" w:ascii="Bahnschrift" w:hAnsi="Bahnschrift" w:cs="Bahnschrift"/>
         </w:rPr>
         <w:t xml:space="preserve"> </w:t>
+      </w:r>
+      <w:r>
+        <w:rPr>
+          <w:rFonts w:hint="default" w:ascii="Bahnschrift" w:hAnsi="Bahnschrift" w:cs="Bahnschrift"/>
+          <w:lang w:val="en-US"/>
+        </w:rPr>
+        <w:t>find the agnets and the machine taking you back to base</w:t>
       </w:r>
     </w:p>
     <w:p>
@@ -5035,6 +5377,13 @@
           <w:lang w:val="en-US"/>
         </w:rPr>
       </w:pPr>
+      <w:r>
+        <w:rPr>
+          <w:rFonts w:hint="default" w:ascii="Bahnschrift" w:hAnsi="Bahnschrift" w:cs="Bahnschrift"/>
+          <w:lang w:val="en-US"/>
+        </w:rPr>
+        <w:t>Gameplay UI</w:t>
+      </w:r>
     </w:p>
     <w:p>
       <w:pPr>
@@ -5053,6 +5402,49 @@
           <w:lang w:val="en-US"/>
         </w:rPr>
       </w:pPr>
+      <w:r>
+        <w:rPr>
+          <w:rFonts w:hint="default" w:ascii="Bahnschrift" w:hAnsi="Bahnschrift" w:cs="Bahnschrift"/>
+          <w:lang w:val="en-US"/>
+        </w:rPr>
+        <w:drawing>
+          <wp:inline distT="0" distB="0" distL="114300" distR="114300">
+            <wp:extent cx="4286250" cy="2800350"/>
+            <wp:effectExtent l="0" t="0" r="0" b="0"/>
+            <wp:docPr id="8" name="Picture 8" descr="gameplay ui"/>
+            <wp:cNvGraphicFramePr>
+              <a:graphicFrameLocks xmlns:a="http://schemas.openxmlformats.org/drawingml/2006/main" noChangeAspect="1"/>
+            </wp:cNvGraphicFramePr>
+            <a:graphic xmlns:a="http://schemas.openxmlformats.org/drawingml/2006/main">
+              <a:graphicData uri="http://schemas.openxmlformats.org/drawingml/2006/picture">
+                <pic:pic xmlns:pic="http://schemas.openxmlformats.org/drawingml/2006/picture">
+                  <pic:nvPicPr>
+                    <pic:cNvPr id="8" name="Picture 8" descr="gameplay ui"/>
+                    <pic:cNvPicPr>
+                      <a:picLocks noChangeAspect="1"/>
+                    </pic:cNvPicPr>
+                  </pic:nvPicPr>
+                  <pic:blipFill>
+                    <a:blip r:embed="rId11"/>
+                    <a:stretch>
+                      <a:fillRect/>
+                    </a:stretch>
+                  </pic:blipFill>
+                  <pic:spPr>
+                    <a:xfrm>
+                      <a:off x="0" y="0"/>
+                      <a:ext cx="4286250" cy="2800350"/>
+                    </a:xfrm>
+                    <a:prstGeom prst="rect">
+                      <a:avLst/>
+                    </a:prstGeom>
+                  </pic:spPr>
+                </pic:pic>
+              </a:graphicData>
+            </a:graphic>
+          </wp:inline>
+        </w:drawing>
+      </w:r>
     </w:p>
     <w:p>
       <w:pPr>
@@ -5071,6 +5463,54 @@
           <w:lang w:val="en-US"/>
         </w:rPr>
       </w:pPr>
+    </w:p>
+    <w:p>
+      <w:pPr>
+        <w:jc w:val="left"/>
+        <w:rPr>
+          <w:rFonts w:hint="default" w:ascii="Bahnschrift" w:hAnsi="Bahnschrift" w:cs="Bahnschrift"/>
+          <w:lang w:val="en-US"/>
+        </w:rPr>
+      </w:pPr>
+      <w:r>
+        <w:rPr>
+          <w:rFonts w:hint="default" w:ascii="Bahnschrift" w:hAnsi="Bahnschrift" w:cs="Bahnschrift"/>
+          <w:lang w:val="en-US"/>
+        </w:rPr>
+        <w:t>The icons on the top left: The 3 circles will be the head image of the player character. The health bar will be switch for a hollow knight style of health display. The players head. Then the stamina bar will be below.</w:t>
+      </w:r>
+    </w:p>
+    <w:p>
+      <w:pPr>
+        <w:jc w:val="left"/>
+        <w:rPr>
+          <w:rFonts w:hint="default" w:ascii="Bahnschrift" w:hAnsi="Bahnschrift" w:cs="Bahnschrift"/>
+          <w:lang w:val="en-US"/>
+        </w:rPr>
+      </w:pPr>
+      <w:r>
+        <w:rPr>
+          <w:rFonts w:hint="default" w:ascii="Bahnschrift" w:hAnsi="Bahnschrift" w:cs="Bahnschrift"/>
+          <w:lang w:val="en-US"/>
+        </w:rPr>
+        <w:t>The one on the right is the coin counter, it is ususlayu hiodden from dispolay until the player collects a coiin, pupop or defeats an enemy or boss and is rewarded.</w:t>
+      </w:r>
+    </w:p>
+    <w:p>
+      <w:pPr>
+        <w:jc w:val="left"/>
+        <w:rPr>
+          <w:rFonts w:hint="default" w:ascii="Bahnschrift" w:hAnsi="Bahnschrift" w:cs="Bahnschrift"/>
+          <w:lang w:val="en-US"/>
+        </w:rPr>
+      </w:pPr>
+      <w:r>
+        <w:rPr>
+          <w:rFonts w:hint="default" w:ascii="Bahnschrift" w:hAnsi="Bahnschrift" w:cs="Bahnschrift"/>
+          <w:lang w:val="en-US"/>
+        </w:rPr>
+        <w:t>E to interact shows up when the player is interacting with interactable objects.</w:t>
+      </w:r>
     </w:p>
     <w:sectPr>
       <w:pgSz w:w="11906" w:h="16838"/>

</xml_diff>

<commit_message>
Added Enemies and Variety, Added powerups, Training level, PlayerDead State
added enemies, kill zone, player dead ui, and almost done with training level
</commit_message>
<xml_diff>
--- a/Assets/Documentation/AGENT INFO GAME DOCUMENTATION.docx
+++ b/Assets/Documentation/AGENT INFO GAME DOCUMENTATION.docx
@@ -484,16 +484,7 @@
           <w:rFonts w:hint="default" w:ascii="Bahnschrift" w:hAnsi="Bahnschrift" w:cs="Bahnschrift"/>
           <w:lang w:val="en-US"/>
         </w:rPr>
-        <w:t xml:space="preserve">TinyMushroomType enemies: </w:t>
-      </w:r>
-      <w:bookmarkStart w:id="0" w:name="_GoBack"/>
-      <w:bookmarkEnd w:id="0"/>
-      <w:r>
-        <w:rPr>
-          <w:rFonts w:hint="default" w:ascii="Bahnschrift" w:hAnsi="Bahnschrift" w:cs="Bahnschrift"/>
-          <w:lang w:val="en-US"/>
-        </w:rPr>
-        <w:t xml:space="preserve">kamikazie </w:t>
+        <w:t xml:space="preserve">TinyMushroomType enemies: kamikazie </w:t>
       </w:r>
     </w:p>
     <w:p>
@@ -1247,15 +1238,2305 @@
         <w:spacing w:line="240" w:lineRule="auto"/>
         <w:rPr>
           <w:rFonts w:hint="default" w:ascii="Bahnschrift" w:hAnsi="Bahnschrift" w:cs="Bahnschrift"/>
-          <w:lang w:val="en-US"/>
-        </w:rPr>
-      </w:pPr>
-      <w:r>
-        <w:rPr>
-          <w:rFonts w:hint="default" w:ascii="Bahnschrift" w:hAnsi="Bahnschrift" w:cs="Bahnschrift"/>
-          <w:lang w:val="en-US"/>
-        </w:rPr>
-        <w:t>LEVEL2:</w:t>
+        </w:rPr>
+      </w:pPr>
+      <w:r>
+        <w:rPr>
+          <w:rFonts w:hint="default" w:ascii="Bahnschrift" w:hAnsi="Bahnschrift" w:cs="Bahnschrift"/>
+          <w:lang w:val="en-US"/>
+        </w:rPr>
+        <w:t>LEVEL2: THE CITY</w:t>
+      </w:r>
+    </w:p>
+    <w:p>
+      <w:pPr>
+        <w:pStyle w:val="4"/>
+        <w:keepNext w:val="0"/>
+        <w:keepLines w:val="0"/>
+        <w:pageBreakBefore w:val="0"/>
+        <w:widowControl/>
+        <w:suppressLineNumbers w:val="0"/>
+        <w:kinsoku/>
+        <w:wordWrap/>
+        <w:overflowPunct/>
+        <w:topLinePunct w:val="0"/>
+        <w:autoSpaceDE/>
+        <w:autoSpaceDN/>
+        <w:bidi w:val="0"/>
+        <w:adjustRightInd/>
+        <w:snapToGrid/>
+        <w:spacing w:before="0" w:beforeAutospacing="0" w:line="204" w:lineRule="auto"/>
+        <w:ind w:left="-1" w:leftChars="0" w:firstLine="0" w:firstLineChars="0"/>
+        <w:textAlignment w:val="auto"/>
+        <w:rPr>
+          <w:rFonts w:hint="default" w:ascii="Bahnschrift" w:hAnsi="Bahnschrift" w:cs="Bahnschrift"/>
+          <w:sz w:val="22"/>
+          <w:szCs w:val="22"/>
+          <w:u w:val="single"/>
+        </w:rPr>
+      </w:pPr>
+      <w:r>
+        <w:rPr>
+          <w:rStyle w:val="11"/>
+          <w:rFonts w:hint="default" w:ascii="Bahnschrift" w:hAnsi="Bahnschrift" w:cs="Bahnschrift"/>
+          <w:b/>
+          <w:bCs/>
+          <w:sz w:val="22"/>
+          <w:szCs w:val="22"/>
+          <w:u w:val="single"/>
+        </w:rPr>
+        <w:t>NPC1 – Bob (Hired but Hesitant)</w:t>
+      </w:r>
+    </w:p>
+    <w:p>
+      <w:pPr>
+        <w:pStyle w:val="10"/>
+        <w:keepNext w:val="0"/>
+        <w:keepLines w:val="0"/>
+        <w:pageBreakBefore w:val="0"/>
+        <w:widowControl/>
+        <w:suppressLineNumbers w:val="0"/>
+        <w:kinsoku/>
+        <w:wordWrap/>
+        <w:overflowPunct/>
+        <w:topLinePunct w:val="0"/>
+        <w:autoSpaceDE/>
+        <w:autoSpaceDN/>
+        <w:bidi w:val="0"/>
+        <w:adjustRightInd/>
+        <w:snapToGrid/>
+        <w:spacing w:before="0" w:beforeAutospacing="0" w:line="204" w:lineRule="auto"/>
+        <w:ind w:left="-1" w:leftChars="0" w:firstLine="0" w:firstLineChars="0"/>
+        <w:textAlignment w:val="auto"/>
+        <w:rPr>
+          <w:rFonts w:hint="default" w:ascii="Bahnschrift" w:hAnsi="Bahnschrift" w:cs="Bahnschrift"/>
+        </w:rPr>
+      </w:pPr>
+      <w:r>
+        <w:rPr>
+          <w:rStyle w:val="9"/>
+          <w:rFonts w:hint="default" w:ascii="Bahnschrift" w:hAnsi="Bahnschrift" w:cs="Bahnschrift"/>
+        </w:rPr>
+        <w:t>Bob is pacing, looking uneasy. The player interacts with him.</w:t>
+      </w:r>
+    </w:p>
+    <w:p>
+      <w:pPr>
+        <w:pStyle w:val="10"/>
+        <w:keepNext w:val="0"/>
+        <w:keepLines w:val="0"/>
+        <w:pageBreakBefore w:val="0"/>
+        <w:widowControl/>
+        <w:suppressLineNumbers w:val="0"/>
+        <w:kinsoku/>
+        <w:wordWrap/>
+        <w:overflowPunct/>
+        <w:topLinePunct w:val="0"/>
+        <w:autoSpaceDE/>
+        <w:autoSpaceDN/>
+        <w:bidi w:val="0"/>
+        <w:adjustRightInd/>
+        <w:snapToGrid/>
+        <w:spacing w:before="0" w:beforeAutospacing="0" w:line="204" w:lineRule="auto"/>
+        <w:ind w:left="-1" w:leftChars="0" w:firstLine="0" w:firstLineChars="0"/>
+        <w:textAlignment w:val="auto"/>
+        <w:rPr>
+          <w:rFonts w:hint="default" w:ascii="Bahnschrift" w:hAnsi="Bahnschrift" w:cs="Bahnschrift"/>
+        </w:rPr>
+      </w:pPr>
+      <w:r>
+        <w:rPr>
+          <w:rStyle w:val="11"/>
+          <w:rFonts w:hint="default" w:ascii="Bahnschrift" w:hAnsi="Bahnschrift" w:cs="Bahnschrift"/>
+        </w:rPr>
+        <w:t>Bob:</w:t>
+      </w:r>
+      <w:r>
+        <w:rPr>
+          <w:rFonts w:hint="default" w:ascii="Bahnschrift" w:hAnsi="Bahnschrift" w:cs="Bahnschrift"/>
+        </w:rPr>
+        <w:t xml:space="preserve"> </w:t>
+      </w:r>
+      <w:r>
+        <w:rPr>
+          <w:rStyle w:val="9"/>
+          <w:rFonts w:hint="default" w:ascii="Bahnschrift" w:hAnsi="Bahnschrift" w:cs="Bahnschrift"/>
+        </w:rPr>
+        <w:t>[muttering]</w:t>
+      </w:r>
+      <w:r>
+        <w:rPr>
+          <w:rFonts w:hint="default" w:ascii="Bahnschrift" w:hAnsi="Bahnschrift" w:cs="Bahnschrift"/>
+        </w:rPr>
+        <w:t xml:space="preserve"> Man… this is messed up…</w:t>
+      </w:r>
+    </w:p>
+    <w:p>
+      <w:pPr>
+        <w:pStyle w:val="10"/>
+        <w:keepNext w:val="0"/>
+        <w:keepLines w:val="0"/>
+        <w:pageBreakBefore w:val="0"/>
+        <w:widowControl/>
+        <w:suppressLineNumbers w:val="0"/>
+        <w:kinsoku/>
+        <w:wordWrap/>
+        <w:overflowPunct/>
+        <w:topLinePunct w:val="0"/>
+        <w:autoSpaceDE/>
+        <w:autoSpaceDN/>
+        <w:bidi w:val="0"/>
+        <w:adjustRightInd/>
+        <w:snapToGrid/>
+        <w:spacing w:before="0" w:beforeAutospacing="0" w:line="204" w:lineRule="auto"/>
+        <w:ind w:left="-1" w:leftChars="0" w:firstLine="0" w:firstLineChars="0"/>
+        <w:textAlignment w:val="auto"/>
+        <w:rPr>
+          <w:rFonts w:hint="default" w:ascii="Bahnschrift" w:hAnsi="Bahnschrift" w:cs="Bahnschrift"/>
+        </w:rPr>
+      </w:pPr>
+      <w:r>
+        <w:rPr>
+          <w:rStyle w:val="11"/>
+          <w:rFonts w:hint="default" w:ascii="Bahnschrift" w:hAnsi="Bahnschrift" w:cs="Bahnschrift"/>
+        </w:rPr>
+        <w:t>Agent:</w:t>
+      </w:r>
+      <w:r>
+        <w:rPr>
+          <w:rFonts w:hint="default" w:ascii="Bahnschrift" w:hAnsi="Bahnschrift" w:cs="Bahnschrift"/>
+        </w:rPr>
+        <w:t xml:space="preserve"> Something wrong?</w:t>
+      </w:r>
+    </w:p>
+    <w:p>
+      <w:pPr>
+        <w:pStyle w:val="10"/>
+        <w:keepNext w:val="0"/>
+        <w:keepLines w:val="0"/>
+        <w:pageBreakBefore w:val="0"/>
+        <w:widowControl/>
+        <w:suppressLineNumbers w:val="0"/>
+        <w:kinsoku/>
+        <w:wordWrap/>
+        <w:overflowPunct/>
+        <w:topLinePunct w:val="0"/>
+        <w:autoSpaceDE/>
+        <w:autoSpaceDN/>
+        <w:bidi w:val="0"/>
+        <w:adjustRightInd/>
+        <w:snapToGrid/>
+        <w:spacing w:before="0" w:beforeAutospacing="0" w:line="204" w:lineRule="auto"/>
+        <w:ind w:left="-1" w:leftChars="0" w:firstLine="0" w:firstLineChars="0"/>
+        <w:textAlignment w:val="auto"/>
+        <w:rPr>
+          <w:rFonts w:hint="default" w:ascii="Bahnschrift" w:hAnsi="Bahnschrift" w:cs="Bahnschrift"/>
+        </w:rPr>
+      </w:pPr>
+      <w:r>
+        <w:rPr>
+          <w:rStyle w:val="11"/>
+          <w:rFonts w:hint="default" w:ascii="Bahnschrift" w:hAnsi="Bahnschrift" w:cs="Bahnschrift"/>
+        </w:rPr>
+        <w:t>Bob:</w:t>
+      </w:r>
+      <w:r>
+        <w:rPr>
+          <w:rFonts w:hint="default" w:ascii="Bahnschrift" w:hAnsi="Bahnschrift" w:cs="Bahnschrift"/>
+        </w:rPr>
+        <w:t xml:space="preserve"> Oh, uh… It’s nothing. Just—forget it.</w:t>
+      </w:r>
+    </w:p>
+    <w:p>
+      <w:pPr>
+        <w:pStyle w:val="10"/>
+        <w:keepNext w:val="0"/>
+        <w:keepLines w:val="0"/>
+        <w:pageBreakBefore w:val="0"/>
+        <w:widowControl/>
+        <w:suppressLineNumbers w:val="0"/>
+        <w:kinsoku/>
+        <w:wordWrap/>
+        <w:overflowPunct/>
+        <w:topLinePunct w:val="0"/>
+        <w:autoSpaceDE/>
+        <w:autoSpaceDN/>
+        <w:bidi w:val="0"/>
+        <w:adjustRightInd/>
+        <w:snapToGrid/>
+        <w:spacing w:before="0" w:beforeAutospacing="0" w:line="204" w:lineRule="auto"/>
+        <w:ind w:left="-1" w:leftChars="0" w:firstLine="0" w:firstLineChars="0"/>
+        <w:textAlignment w:val="auto"/>
+        <w:rPr>
+          <w:rFonts w:hint="default" w:ascii="Bahnschrift" w:hAnsi="Bahnschrift" w:cs="Bahnschrift"/>
+        </w:rPr>
+      </w:pPr>
+      <w:r>
+        <w:rPr>
+          <w:rStyle w:val="11"/>
+          <w:rFonts w:hint="default" w:ascii="Bahnschrift" w:hAnsi="Bahnschrift" w:cs="Bahnschrift"/>
+        </w:rPr>
+        <w:t>Agent:</w:t>
+      </w:r>
+      <w:r>
+        <w:rPr>
+          <w:rFonts w:hint="default" w:ascii="Bahnschrift" w:hAnsi="Bahnschrift" w:cs="Bahnschrift"/>
+        </w:rPr>
+        <w:t xml:space="preserve"> Doesn’t sound like nothing. You look like you’re about to explode.</w:t>
+      </w:r>
+    </w:p>
+    <w:p>
+      <w:pPr>
+        <w:pStyle w:val="10"/>
+        <w:keepNext w:val="0"/>
+        <w:keepLines w:val="0"/>
+        <w:pageBreakBefore w:val="0"/>
+        <w:widowControl/>
+        <w:suppressLineNumbers w:val="0"/>
+        <w:kinsoku/>
+        <w:wordWrap/>
+        <w:overflowPunct/>
+        <w:topLinePunct w:val="0"/>
+        <w:autoSpaceDE/>
+        <w:autoSpaceDN/>
+        <w:bidi w:val="0"/>
+        <w:adjustRightInd/>
+        <w:snapToGrid/>
+        <w:spacing w:before="0" w:beforeAutospacing="0" w:line="204" w:lineRule="auto"/>
+        <w:ind w:left="-1" w:leftChars="0" w:firstLine="0" w:firstLineChars="0"/>
+        <w:textAlignment w:val="auto"/>
+        <w:rPr>
+          <w:rFonts w:hint="default" w:ascii="Bahnschrift" w:hAnsi="Bahnschrift" w:cs="Bahnschrift"/>
+        </w:rPr>
+      </w:pPr>
+      <w:r>
+        <w:rPr>
+          <w:rStyle w:val="11"/>
+          <w:rFonts w:hint="default" w:ascii="Bahnschrift" w:hAnsi="Bahnschrift" w:cs="Bahnschrift"/>
+        </w:rPr>
+        <w:t>Bob:</w:t>
+      </w:r>
+      <w:r>
+        <w:rPr>
+          <w:rFonts w:hint="default" w:ascii="Bahnschrift" w:hAnsi="Bahnschrift" w:cs="Bahnschrift"/>
+        </w:rPr>
+        <w:t xml:space="preserve"> </w:t>
+      </w:r>
+      <w:r>
+        <w:rPr>
+          <w:rStyle w:val="9"/>
+          <w:rFonts w:hint="default" w:ascii="Bahnschrift" w:hAnsi="Bahnschrift" w:cs="Bahnschrift"/>
+        </w:rPr>
+        <w:t>[sighs]</w:t>
+      </w:r>
+      <w:r>
+        <w:rPr>
+          <w:rFonts w:hint="default" w:ascii="Bahnschrift" w:hAnsi="Bahnschrift" w:cs="Bahnschrift"/>
+        </w:rPr>
+        <w:t xml:space="preserve"> Alright, fine. The Mayor hired me to post some stuff online. Stir people up a bit, get them talking. But the more I think about it, the worse it feels.</w:t>
+      </w:r>
+    </w:p>
+    <w:p>
+      <w:pPr>
+        <w:pStyle w:val="10"/>
+        <w:keepNext w:val="0"/>
+        <w:keepLines w:val="0"/>
+        <w:pageBreakBefore w:val="0"/>
+        <w:widowControl/>
+        <w:suppressLineNumbers w:val="0"/>
+        <w:kinsoku/>
+        <w:wordWrap/>
+        <w:overflowPunct/>
+        <w:topLinePunct w:val="0"/>
+        <w:autoSpaceDE/>
+        <w:autoSpaceDN/>
+        <w:bidi w:val="0"/>
+        <w:adjustRightInd/>
+        <w:snapToGrid/>
+        <w:spacing w:before="0" w:beforeAutospacing="0" w:line="204" w:lineRule="auto"/>
+        <w:ind w:left="-1" w:leftChars="0" w:firstLine="0" w:firstLineChars="0"/>
+        <w:textAlignment w:val="auto"/>
+        <w:rPr>
+          <w:rFonts w:hint="default" w:ascii="Bahnschrift" w:hAnsi="Bahnschrift" w:cs="Bahnschrift"/>
+        </w:rPr>
+      </w:pPr>
+      <w:r>
+        <w:rPr>
+          <w:rStyle w:val="11"/>
+          <w:rFonts w:hint="default" w:ascii="Bahnschrift" w:hAnsi="Bahnschrift" w:cs="Bahnschrift"/>
+        </w:rPr>
+        <w:t>Agent:</w:t>
+      </w:r>
+      <w:r>
+        <w:rPr>
+          <w:rFonts w:hint="default" w:ascii="Bahnschrift" w:hAnsi="Bahnschrift" w:cs="Bahnschrift"/>
+        </w:rPr>
+        <w:t xml:space="preserve"> What exactly did he ask you to post?</w:t>
+      </w:r>
+    </w:p>
+    <w:p>
+      <w:pPr>
+        <w:pStyle w:val="10"/>
+        <w:keepNext w:val="0"/>
+        <w:keepLines w:val="0"/>
+        <w:pageBreakBefore w:val="0"/>
+        <w:widowControl/>
+        <w:suppressLineNumbers w:val="0"/>
+        <w:kinsoku/>
+        <w:wordWrap/>
+        <w:overflowPunct/>
+        <w:topLinePunct w:val="0"/>
+        <w:autoSpaceDE/>
+        <w:autoSpaceDN/>
+        <w:bidi w:val="0"/>
+        <w:adjustRightInd/>
+        <w:snapToGrid/>
+        <w:spacing w:before="0" w:beforeAutospacing="0" w:line="204" w:lineRule="auto"/>
+        <w:ind w:left="-1" w:leftChars="0" w:firstLine="0" w:firstLineChars="0"/>
+        <w:textAlignment w:val="auto"/>
+        <w:rPr>
+          <w:rFonts w:hint="default" w:ascii="Bahnschrift" w:hAnsi="Bahnschrift" w:cs="Bahnschrift"/>
+        </w:rPr>
+      </w:pPr>
+      <w:r>
+        <w:rPr>
+          <w:rStyle w:val="11"/>
+          <w:rFonts w:hint="default" w:ascii="Bahnschrift" w:hAnsi="Bahnschrift" w:cs="Bahnschrift"/>
+        </w:rPr>
+        <w:t>Bob:</w:t>
+      </w:r>
+      <w:r>
+        <w:rPr>
+          <w:rFonts w:hint="default" w:ascii="Bahnschrift" w:hAnsi="Bahnschrift" w:cs="Bahnschrift"/>
+        </w:rPr>
+        <w:t xml:space="preserve"> He gave me some “facts” about his opponent. Except… I checked. Some of it’s twisted, and some of it’s just plain false.</w:t>
+      </w:r>
+    </w:p>
+    <w:p>
+      <w:pPr>
+        <w:pStyle w:val="10"/>
+        <w:keepNext w:val="0"/>
+        <w:keepLines w:val="0"/>
+        <w:pageBreakBefore w:val="0"/>
+        <w:widowControl/>
+        <w:suppressLineNumbers w:val="0"/>
+        <w:kinsoku/>
+        <w:wordWrap/>
+        <w:overflowPunct/>
+        <w:topLinePunct w:val="0"/>
+        <w:autoSpaceDE/>
+        <w:autoSpaceDN/>
+        <w:bidi w:val="0"/>
+        <w:adjustRightInd/>
+        <w:snapToGrid/>
+        <w:spacing w:before="0" w:beforeAutospacing="0" w:line="204" w:lineRule="auto"/>
+        <w:ind w:left="-1" w:leftChars="0" w:firstLine="0" w:firstLineChars="0"/>
+        <w:textAlignment w:val="auto"/>
+        <w:rPr>
+          <w:rFonts w:hint="default" w:ascii="Bahnschrift" w:hAnsi="Bahnschrift" w:cs="Bahnschrift"/>
+        </w:rPr>
+      </w:pPr>
+      <w:r>
+        <w:rPr>
+          <w:rStyle w:val="11"/>
+          <w:rFonts w:hint="default" w:ascii="Bahnschrift" w:hAnsi="Bahnschrift" w:cs="Bahnschrift"/>
+        </w:rPr>
+        <w:t>Agent:</w:t>
+      </w:r>
+      <w:r>
+        <w:rPr>
+          <w:rFonts w:hint="default" w:ascii="Bahnschrift" w:hAnsi="Bahnschrift" w:cs="Bahnschrift"/>
+        </w:rPr>
+        <w:t xml:space="preserve"> That’s called disinformation—spreading false info </w:t>
+      </w:r>
+      <w:r>
+        <w:rPr>
+          <w:rStyle w:val="9"/>
+          <w:rFonts w:hint="default" w:ascii="Bahnschrift" w:hAnsi="Bahnschrift" w:cs="Bahnschrift"/>
+        </w:rPr>
+        <w:t>on purpose</w:t>
+      </w:r>
+      <w:r>
+        <w:rPr>
+          <w:rFonts w:hint="default" w:ascii="Bahnschrift" w:hAnsi="Bahnschrift" w:cs="Bahnschrift"/>
+        </w:rPr>
+        <w:t xml:space="preserve"> to manipulate people.</w:t>
+      </w:r>
+    </w:p>
+    <w:p>
+      <w:pPr>
+        <w:pStyle w:val="10"/>
+        <w:keepNext w:val="0"/>
+        <w:keepLines w:val="0"/>
+        <w:pageBreakBefore w:val="0"/>
+        <w:widowControl/>
+        <w:suppressLineNumbers w:val="0"/>
+        <w:kinsoku/>
+        <w:wordWrap/>
+        <w:overflowPunct/>
+        <w:topLinePunct w:val="0"/>
+        <w:autoSpaceDE/>
+        <w:autoSpaceDN/>
+        <w:bidi w:val="0"/>
+        <w:adjustRightInd/>
+        <w:snapToGrid/>
+        <w:spacing w:before="0" w:beforeAutospacing="0" w:line="204" w:lineRule="auto"/>
+        <w:ind w:left="-1" w:leftChars="0" w:firstLine="0" w:firstLineChars="0"/>
+        <w:textAlignment w:val="auto"/>
+        <w:rPr>
+          <w:rFonts w:hint="default" w:ascii="Bahnschrift" w:hAnsi="Bahnschrift" w:cs="Bahnschrift"/>
+        </w:rPr>
+      </w:pPr>
+      <w:r>
+        <w:rPr>
+          <w:rStyle w:val="11"/>
+          <w:rFonts w:hint="default" w:ascii="Bahnschrift" w:hAnsi="Bahnschrift" w:cs="Bahnschrift"/>
+        </w:rPr>
+        <w:t>Bob:</w:t>
+      </w:r>
+      <w:r>
+        <w:rPr>
+          <w:rFonts w:hint="default" w:ascii="Bahnschrift" w:hAnsi="Bahnschrift" w:cs="Bahnschrift"/>
+        </w:rPr>
+        <w:t xml:space="preserve"> Right? And people will believe it! No one checks things anymore.</w:t>
+      </w:r>
+    </w:p>
+    <w:p>
+      <w:pPr>
+        <w:pStyle w:val="10"/>
+        <w:keepNext w:val="0"/>
+        <w:keepLines w:val="0"/>
+        <w:pageBreakBefore w:val="0"/>
+        <w:widowControl/>
+        <w:suppressLineNumbers w:val="0"/>
+        <w:kinsoku/>
+        <w:wordWrap/>
+        <w:overflowPunct/>
+        <w:topLinePunct w:val="0"/>
+        <w:autoSpaceDE/>
+        <w:autoSpaceDN/>
+        <w:bidi w:val="0"/>
+        <w:adjustRightInd/>
+        <w:snapToGrid/>
+        <w:spacing w:before="0" w:beforeAutospacing="0" w:line="204" w:lineRule="auto"/>
+        <w:ind w:left="-1" w:leftChars="0" w:firstLine="0" w:firstLineChars="0"/>
+        <w:textAlignment w:val="auto"/>
+        <w:rPr>
+          <w:rFonts w:hint="default" w:ascii="Bahnschrift" w:hAnsi="Bahnschrift" w:cs="Bahnschrift"/>
+        </w:rPr>
+      </w:pPr>
+      <w:r>
+        <w:rPr>
+          <w:rStyle w:val="11"/>
+          <w:rFonts w:hint="default" w:ascii="Bahnschrift" w:hAnsi="Bahnschrift" w:cs="Bahnschrift"/>
+        </w:rPr>
+        <w:t>Agent:</w:t>
+      </w:r>
+      <w:r>
+        <w:rPr>
+          <w:rFonts w:hint="default" w:ascii="Bahnschrift" w:hAnsi="Bahnschrift" w:cs="Bahnschrift"/>
+        </w:rPr>
+        <w:t xml:space="preserve"> That’s the point. Disinformation spreads fast because it plays on emotions—fear, anger, outrage. When people get worked up, they share first, think later.</w:t>
+      </w:r>
+    </w:p>
+    <w:p>
+      <w:pPr>
+        <w:pStyle w:val="10"/>
+        <w:keepNext w:val="0"/>
+        <w:keepLines w:val="0"/>
+        <w:pageBreakBefore w:val="0"/>
+        <w:widowControl/>
+        <w:suppressLineNumbers w:val="0"/>
+        <w:kinsoku/>
+        <w:wordWrap/>
+        <w:overflowPunct/>
+        <w:topLinePunct w:val="0"/>
+        <w:autoSpaceDE/>
+        <w:autoSpaceDN/>
+        <w:bidi w:val="0"/>
+        <w:adjustRightInd/>
+        <w:snapToGrid/>
+        <w:spacing w:before="0" w:beforeAutospacing="0" w:line="204" w:lineRule="auto"/>
+        <w:ind w:left="-1" w:leftChars="0" w:firstLine="0" w:firstLineChars="0"/>
+        <w:textAlignment w:val="auto"/>
+        <w:rPr>
+          <w:rFonts w:hint="default" w:ascii="Bahnschrift" w:hAnsi="Bahnschrift" w:cs="Bahnschrift"/>
+        </w:rPr>
+      </w:pPr>
+      <w:r>
+        <w:rPr>
+          <w:rStyle w:val="11"/>
+          <w:rFonts w:hint="default" w:ascii="Bahnschrift" w:hAnsi="Bahnschrift" w:cs="Bahnschrift"/>
+        </w:rPr>
+        <w:t>Bob:</w:t>
+      </w:r>
+      <w:r>
+        <w:rPr>
+          <w:rFonts w:hint="default" w:ascii="Bahnschrift" w:hAnsi="Bahnschrift" w:cs="Bahnschrift"/>
+        </w:rPr>
+        <w:t xml:space="preserve"> …Yeah, I don’t want to be part of that.</w:t>
+      </w:r>
+    </w:p>
+    <w:p>
+      <w:pPr>
+        <w:pStyle w:val="10"/>
+        <w:keepNext w:val="0"/>
+        <w:keepLines w:val="0"/>
+        <w:pageBreakBefore w:val="0"/>
+        <w:widowControl/>
+        <w:suppressLineNumbers w:val="0"/>
+        <w:kinsoku/>
+        <w:wordWrap/>
+        <w:overflowPunct/>
+        <w:topLinePunct w:val="0"/>
+        <w:autoSpaceDE/>
+        <w:autoSpaceDN/>
+        <w:bidi w:val="0"/>
+        <w:adjustRightInd/>
+        <w:snapToGrid/>
+        <w:spacing w:before="0" w:beforeAutospacing="0" w:line="204" w:lineRule="auto"/>
+        <w:ind w:left="-1" w:leftChars="0" w:firstLine="0" w:firstLineChars="0"/>
+        <w:textAlignment w:val="auto"/>
+        <w:rPr>
+          <w:rFonts w:hint="default" w:ascii="Bahnschrift" w:hAnsi="Bahnschrift" w:cs="Bahnschrift"/>
+        </w:rPr>
+      </w:pPr>
+      <w:r>
+        <w:rPr>
+          <w:rStyle w:val="11"/>
+          <w:rFonts w:hint="default" w:ascii="Bahnschrift" w:hAnsi="Bahnschrift" w:cs="Bahnschrift"/>
+        </w:rPr>
+        <w:t>Agent:</w:t>
+      </w:r>
+      <w:r>
+        <w:rPr>
+          <w:rFonts w:hint="default" w:ascii="Bahnschrift" w:hAnsi="Bahnschrift" w:cs="Bahnschrift"/>
+        </w:rPr>
+        <w:t xml:space="preserve"> Smart choice. A few clicks might not seem like a big deal, but lies can do real damage.</w:t>
+      </w:r>
+    </w:p>
+    <w:p>
+      <w:pPr>
+        <w:pStyle w:val="10"/>
+        <w:keepNext w:val="0"/>
+        <w:keepLines w:val="0"/>
+        <w:pageBreakBefore w:val="0"/>
+        <w:widowControl/>
+        <w:suppressLineNumbers w:val="0"/>
+        <w:kinsoku/>
+        <w:wordWrap/>
+        <w:overflowPunct/>
+        <w:topLinePunct w:val="0"/>
+        <w:autoSpaceDE/>
+        <w:autoSpaceDN/>
+        <w:bidi w:val="0"/>
+        <w:adjustRightInd/>
+        <w:snapToGrid/>
+        <w:spacing w:before="0" w:beforeAutospacing="0" w:line="204" w:lineRule="auto"/>
+        <w:ind w:left="-1" w:leftChars="0" w:firstLine="0" w:firstLineChars="0"/>
+        <w:textAlignment w:val="auto"/>
+        <w:rPr>
+          <w:rFonts w:hint="default" w:ascii="Bahnschrift" w:hAnsi="Bahnschrift" w:cs="Bahnschrift"/>
+        </w:rPr>
+      </w:pPr>
+      <w:r>
+        <w:rPr>
+          <w:rStyle w:val="11"/>
+          <w:rFonts w:hint="default" w:ascii="Bahnschrift" w:hAnsi="Bahnschrift" w:cs="Bahnschrift"/>
+        </w:rPr>
+        <w:t>Bob:</w:t>
+      </w:r>
+      <w:r>
+        <w:rPr>
+          <w:rFonts w:hint="default" w:ascii="Bahnschrift" w:hAnsi="Bahnschrift" w:cs="Bahnschrift"/>
+        </w:rPr>
+        <w:t xml:space="preserve"> I guess I should give the money back. Or… I dunno, donate it somewhere good?</w:t>
+      </w:r>
+    </w:p>
+    <w:p>
+      <w:pPr>
+        <w:pStyle w:val="10"/>
+        <w:keepNext w:val="0"/>
+        <w:keepLines w:val="0"/>
+        <w:pageBreakBefore w:val="0"/>
+        <w:widowControl/>
+        <w:suppressLineNumbers w:val="0"/>
+        <w:kinsoku/>
+        <w:wordWrap/>
+        <w:overflowPunct/>
+        <w:topLinePunct w:val="0"/>
+        <w:autoSpaceDE/>
+        <w:autoSpaceDN/>
+        <w:bidi w:val="0"/>
+        <w:adjustRightInd/>
+        <w:snapToGrid/>
+        <w:spacing w:before="0" w:beforeAutospacing="0" w:line="204" w:lineRule="auto"/>
+        <w:ind w:left="-1" w:leftChars="0" w:firstLine="0" w:firstLineChars="0"/>
+        <w:textAlignment w:val="auto"/>
+        <w:rPr>
+          <w:rFonts w:hint="default" w:ascii="Bahnschrift" w:hAnsi="Bahnschrift" w:cs="Bahnschrift"/>
+        </w:rPr>
+      </w:pPr>
+      <w:r>
+        <w:rPr>
+          <w:rStyle w:val="11"/>
+          <w:rFonts w:hint="default" w:ascii="Bahnschrift" w:hAnsi="Bahnschrift" w:cs="Bahnschrift"/>
+        </w:rPr>
+        <w:t>Agent:</w:t>
+      </w:r>
+      <w:r>
+        <w:rPr>
+          <w:rFonts w:hint="default" w:ascii="Bahnschrift" w:hAnsi="Bahnschrift" w:cs="Bahnschrift"/>
+        </w:rPr>
+        <w:t xml:space="preserve"> Now </w:t>
+      </w:r>
+      <w:r>
+        <w:rPr>
+          <w:rStyle w:val="9"/>
+          <w:rFonts w:hint="default" w:ascii="Bahnschrift" w:hAnsi="Bahnschrift" w:cs="Bahnschrift"/>
+        </w:rPr>
+        <w:t>that’s</w:t>
+      </w:r>
+      <w:r>
+        <w:rPr>
+          <w:rFonts w:hint="default" w:ascii="Bahnschrift" w:hAnsi="Bahnschrift" w:cs="Bahnschrift"/>
+        </w:rPr>
+        <w:t xml:space="preserve"> a way to turn things around.</w:t>
+      </w:r>
+    </w:p>
+    <w:p>
+      <w:pPr>
+        <w:pStyle w:val="10"/>
+        <w:keepNext w:val="0"/>
+        <w:keepLines w:val="0"/>
+        <w:pageBreakBefore w:val="0"/>
+        <w:widowControl/>
+        <w:suppressLineNumbers w:val="0"/>
+        <w:kinsoku/>
+        <w:wordWrap/>
+        <w:overflowPunct/>
+        <w:topLinePunct w:val="0"/>
+        <w:autoSpaceDE/>
+        <w:autoSpaceDN/>
+        <w:bidi w:val="0"/>
+        <w:adjustRightInd/>
+        <w:snapToGrid/>
+        <w:spacing w:before="0" w:beforeAutospacing="0" w:line="204" w:lineRule="auto"/>
+        <w:ind w:left="-1" w:leftChars="0" w:firstLine="0" w:firstLineChars="0"/>
+        <w:textAlignment w:val="auto"/>
+        <w:rPr>
+          <w:rFonts w:hint="default" w:ascii="Bahnschrift" w:hAnsi="Bahnschrift" w:cs="Bahnschrift"/>
+        </w:rPr>
+      </w:pPr>
+      <w:r>
+        <w:rPr>
+          <w:rStyle w:val="11"/>
+          <w:rFonts w:hint="default" w:ascii="Bahnschrift" w:hAnsi="Bahnschrift" w:cs="Bahnschrift"/>
+        </w:rPr>
+        <w:t>Bob:</w:t>
+      </w:r>
+      <w:r>
+        <w:rPr>
+          <w:rFonts w:hint="default" w:ascii="Bahnschrift" w:hAnsi="Bahnschrift" w:cs="Bahnschrift"/>
+        </w:rPr>
+        <w:t xml:space="preserve"> Hah. Never thought I’d say this, but thanks.</w:t>
+      </w:r>
+    </w:p>
+    <w:p>
+      <w:pPr>
+        <w:keepNext w:val="0"/>
+        <w:keepLines w:val="0"/>
+        <w:pageBreakBefore w:val="0"/>
+        <w:widowControl/>
+        <w:suppressLineNumbers w:val="0"/>
+        <w:kinsoku/>
+        <w:wordWrap/>
+        <w:overflowPunct/>
+        <w:topLinePunct w:val="0"/>
+        <w:autoSpaceDE/>
+        <w:autoSpaceDN/>
+        <w:bidi w:val="0"/>
+        <w:adjustRightInd/>
+        <w:snapToGrid/>
+        <w:spacing w:before="0" w:beforeAutospacing="0" w:line="204" w:lineRule="auto"/>
+        <w:ind w:left="-1" w:leftChars="0" w:firstLine="0" w:firstLineChars="0"/>
+        <w:textAlignment w:val="auto"/>
+        <w:rPr>
+          <w:rFonts w:hint="default" w:ascii="Bahnschrift" w:hAnsi="Bahnschrift" w:cs="Bahnschrift"/>
+        </w:rPr>
+      </w:pPr>
+    </w:p>
+    <w:p>
+      <w:pPr>
+        <w:pStyle w:val="4"/>
+        <w:keepNext w:val="0"/>
+        <w:keepLines w:val="0"/>
+        <w:pageBreakBefore w:val="0"/>
+        <w:widowControl/>
+        <w:suppressLineNumbers w:val="0"/>
+        <w:kinsoku/>
+        <w:wordWrap/>
+        <w:overflowPunct/>
+        <w:topLinePunct w:val="0"/>
+        <w:autoSpaceDE/>
+        <w:autoSpaceDN/>
+        <w:bidi w:val="0"/>
+        <w:adjustRightInd/>
+        <w:snapToGrid/>
+        <w:spacing w:before="0" w:beforeAutospacing="0" w:line="204" w:lineRule="auto"/>
+        <w:ind w:left="-1" w:leftChars="0" w:firstLine="0" w:firstLineChars="0"/>
+        <w:textAlignment w:val="auto"/>
+        <w:rPr>
+          <w:rFonts w:hint="default" w:ascii="Bahnschrift" w:hAnsi="Bahnschrift" w:cs="Bahnschrift"/>
+          <w:sz w:val="24"/>
+          <w:szCs w:val="24"/>
+          <w:u w:val="single"/>
+        </w:rPr>
+      </w:pPr>
+      <w:r>
+        <w:rPr>
+          <w:rStyle w:val="11"/>
+          <w:rFonts w:hint="default" w:ascii="Bahnschrift" w:hAnsi="Bahnschrift" w:cs="Bahnschrift"/>
+          <w:b/>
+          <w:bCs/>
+          <w:sz w:val="24"/>
+          <w:szCs w:val="24"/>
+          <w:u w:val="single"/>
+        </w:rPr>
+        <w:t>NPC2 – Samantha (Misinformed Citizen)</w:t>
+      </w:r>
+    </w:p>
+    <w:p>
+      <w:pPr>
+        <w:pStyle w:val="10"/>
+        <w:keepNext w:val="0"/>
+        <w:keepLines w:val="0"/>
+        <w:pageBreakBefore w:val="0"/>
+        <w:widowControl/>
+        <w:suppressLineNumbers w:val="0"/>
+        <w:kinsoku/>
+        <w:wordWrap/>
+        <w:overflowPunct/>
+        <w:topLinePunct w:val="0"/>
+        <w:autoSpaceDE/>
+        <w:autoSpaceDN/>
+        <w:bidi w:val="0"/>
+        <w:adjustRightInd/>
+        <w:snapToGrid/>
+        <w:spacing w:before="0" w:beforeAutospacing="0" w:line="204" w:lineRule="auto"/>
+        <w:ind w:left="-1" w:leftChars="0" w:firstLine="0" w:firstLineChars="0"/>
+        <w:textAlignment w:val="auto"/>
+        <w:rPr>
+          <w:rFonts w:hint="default" w:ascii="Bahnschrift" w:hAnsi="Bahnschrift" w:cs="Bahnschrift"/>
+        </w:rPr>
+      </w:pPr>
+      <w:r>
+        <w:rPr>
+          <w:rStyle w:val="9"/>
+          <w:rFonts w:hint="default" w:ascii="Bahnschrift" w:hAnsi="Bahnschrift" w:cs="Bahnschrift"/>
+        </w:rPr>
+        <w:t>Samantha is on her phone, smiling as she scrolls through posts.</w:t>
+      </w:r>
+    </w:p>
+    <w:p>
+      <w:pPr>
+        <w:pStyle w:val="10"/>
+        <w:keepNext w:val="0"/>
+        <w:keepLines w:val="0"/>
+        <w:pageBreakBefore w:val="0"/>
+        <w:widowControl/>
+        <w:suppressLineNumbers w:val="0"/>
+        <w:kinsoku/>
+        <w:wordWrap/>
+        <w:overflowPunct/>
+        <w:topLinePunct w:val="0"/>
+        <w:autoSpaceDE/>
+        <w:autoSpaceDN/>
+        <w:bidi w:val="0"/>
+        <w:adjustRightInd/>
+        <w:snapToGrid/>
+        <w:spacing w:before="0" w:beforeAutospacing="0" w:line="204" w:lineRule="auto"/>
+        <w:ind w:left="-1" w:leftChars="0" w:firstLine="0" w:firstLineChars="0"/>
+        <w:textAlignment w:val="auto"/>
+        <w:rPr>
+          <w:rFonts w:hint="default" w:ascii="Bahnschrift" w:hAnsi="Bahnschrift" w:cs="Bahnschrift"/>
+        </w:rPr>
+      </w:pPr>
+      <w:r>
+        <w:rPr>
+          <w:rStyle w:val="11"/>
+          <w:rFonts w:hint="default" w:ascii="Bahnschrift" w:hAnsi="Bahnschrift" w:cs="Bahnschrift"/>
+        </w:rPr>
+        <w:t>Samantha:</w:t>
+      </w:r>
+      <w:r>
+        <w:rPr>
+          <w:rFonts w:hint="default" w:ascii="Bahnschrift" w:hAnsi="Bahnschrift" w:cs="Bahnschrift"/>
+        </w:rPr>
+        <w:t xml:space="preserve"> </w:t>
+      </w:r>
+      <w:r>
+        <w:rPr>
+          <w:rStyle w:val="9"/>
+          <w:rFonts w:hint="default" w:ascii="Bahnschrift" w:hAnsi="Bahnschrift" w:cs="Bahnschrift"/>
+        </w:rPr>
+        <w:t>[laughs]</w:t>
+      </w:r>
+      <w:r>
+        <w:rPr>
+          <w:rFonts w:hint="default" w:ascii="Bahnschrift" w:hAnsi="Bahnschrift" w:cs="Bahnschrift"/>
+        </w:rPr>
+        <w:t xml:space="preserve"> No way! Did you see this? The Mayor just exposed some crazy stuff!</w:t>
+      </w:r>
+    </w:p>
+    <w:p>
+      <w:pPr>
+        <w:pStyle w:val="10"/>
+        <w:keepNext w:val="0"/>
+        <w:keepLines w:val="0"/>
+        <w:pageBreakBefore w:val="0"/>
+        <w:widowControl/>
+        <w:suppressLineNumbers w:val="0"/>
+        <w:kinsoku/>
+        <w:wordWrap/>
+        <w:overflowPunct/>
+        <w:topLinePunct w:val="0"/>
+        <w:autoSpaceDE/>
+        <w:autoSpaceDN/>
+        <w:bidi w:val="0"/>
+        <w:adjustRightInd/>
+        <w:snapToGrid/>
+        <w:spacing w:before="0" w:beforeAutospacing="0" w:line="204" w:lineRule="auto"/>
+        <w:ind w:left="-1" w:leftChars="0" w:firstLine="0" w:firstLineChars="0"/>
+        <w:textAlignment w:val="auto"/>
+        <w:rPr>
+          <w:rFonts w:hint="default" w:ascii="Bahnschrift" w:hAnsi="Bahnschrift" w:cs="Bahnschrift"/>
+        </w:rPr>
+      </w:pPr>
+      <w:r>
+        <w:rPr>
+          <w:rStyle w:val="11"/>
+          <w:rFonts w:hint="default" w:ascii="Bahnschrift" w:hAnsi="Bahnschrift" w:cs="Bahnschrift"/>
+        </w:rPr>
+        <w:t>Agent:</w:t>
+      </w:r>
+      <w:r>
+        <w:rPr>
+          <w:rFonts w:hint="default" w:ascii="Bahnschrift" w:hAnsi="Bahnschrift" w:cs="Bahnschrift"/>
+        </w:rPr>
+        <w:t xml:space="preserve"> What stuff?</w:t>
+      </w:r>
+    </w:p>
+    <w:p>
+      <w:pPr>
+        <w:pStyle w:val="10"/>
+        <w:keepNext w:val="0"/>
+        <w:keepLines w:val="0"/>
+        <w:pageBreakBefore w:val="0"/>
+        <w:widowControl/>
+        <w:suppressLineNumbers w:val="0"/>
+        <w:kinsoku/>
+        <w:wordWrap/>
+        <w:overflowPunct/>
+        <w:topLinePunct w:val="0"/>
+        <w:autoSpaceDE/>
+        <w:autoSpaceDN/>
+        <w:bidi w:val="0"/>
+        <w:adjustRightInd/>
+        <w:snapToGrid/>
+        <w:spacing w:before="0" w:beforeAutospacing="0" w:line="204" w:lineRule="auto"/>
+        <w:ind w:left="-1" w:leftChars="0" w:firstLine="0" w:firstLineChars="0"/>
+        <w:textAlignment w:val="auto"/>
+        <w:rPr>
+          <w:rFonts w:hint="default" w:ascii="Bahnschrift" w:hAnsi="Bahnschrift" w:cs="Bahnschrift"/>
+        </w:rPr>
+      </w:pPr>
+      <w:r>
+        <w:rPr>
+          <w:rStyle w:val="11"/>
+          <w:rFonts w:hint="default" w:ascii="Bahnschrift" w:hAnsi="Bahnschrift" w:cs="Bahnschrift"/>
+        </w:rPr>
+        <w:t>Samantha:</w:t>
+      </w:r>
+      <w:r>
+        <w:rPr>
+          <w:rFonts w:hint="default" w:ascii="Bahnschrift" w:hAnsi="Bahnschrift" w:cs="Bahnschrift"/>
+        </w:rPr>
+        <w:t xml:space="preserve"> Look! </w:t>
+      </w:r>
+      <w:r>
+        <w:rPr>
+          <w:rStyle w:val="9"/>
+          <w:rFonts w:hint="default" w:ascii="Bahnschrift" w:hAnsi="Bahnschrift" w:cs="Bahnschrift"/>
+        </w:rPr>
+        <w:t>[holds up phone]</w:t>
+      </w:r>
+      <w:r>
+        <w:rPr>
+          <w:rFonts w:hint="default" w:ascii="Bahnschrift" w:hAnsi="Bahnschrift" w:cs="Bahnschrift"/>
+        </w:rPr>
+        <w:t xml:space="preserve"> Apparently, the other guy running for office is secretly working with some foreign group. It’s all over the place!</w:t>
+      </w:r>
+    </w:p>
+    <w:p>
+      <w:pPr>
+        <w:pStyle w:val="10"/>
+        <w:keepNext w:val="0"/>
+        <w:keepLines w:val="0"/>
+        <w:pageBreakBefore w:val="0"/>
+        <w:widowControl/>
+        <w:suppressLineNumbers w:val="0"/>
+        <w:kinsoku/>
+        <w:wordWrap/>
+        <w:overflowPunct/>
+        <w:topLinePunct w:val="0"/>
+        <w:autoSpaceDE/>
+        <w:autoSpaceDN/>
+        <w:bidi w:val="0"/>
+        <w:adjustRightInd/>
+        <w:snapToGrid/>
+        <w:spacing w:before="0" w:beforeAutospacing="0" w:line="204" w:lineRule="auto"/>
+        <w:ind w:left="-1" w:leftChars="0" w:firstLine="0" w:firstLineChars="0"/>
+        <w:textAlignment w:val="auto"/>
+        <w:rPr>
+          <w:rFonts w:hint="default" w:ascii="Bahnschrift" w:hAnsi="Bahnschrift" w:cs="Bahnschrift"/>
+        </w:rPr>
+      </w:pPr>
+      <w:r>
+        <w:rPr>
+          <w:rStyle w:val="11"/>
+          <w:rFonts w:hint="default" w:ascii="Bahnschrift" w:hAnsi="Bahnschrift" w:cs="Bahnschrift"/>
+        </w:rPr>
+        <w:t>Agent:</w:t>
+      </w:r>
+      <w:r>
+        <w:rPr>
+          <w:rFonts w:hint="default" w:ascii="Bahnschrift" w:hAnsi="Bahnschrift" w:cs="Bahnschrift"/>
+        </w:rPr>
+        <w:t xml:space="preserve"> Where did this come from?</w:t>
+      </w:r>
+    </w:p>
+    <w:p>
+      <w:pPr>
+        <w:pStyle w:val="10"/>
+        <w:keepNext w:val="0"/>
+        <w:keepLines w:val="0"/>
+        <w:pageBreakBefore w:val="0"/>
+        <w:widowControl/>
+        <w:suppressLineNumbers w:val="0"/>
+        <w:kinsoku/>
+        <w:wordWrap/>
+        <w:overflowPunct/>
+        <w:topLinePunct w:val="0"/>
+        <w:autoSpaceDE/>
+        <w:autoSpaceDN/>
+        <w:bidi w:val="0"/>
+        <w:adjustRightInd/>
+        <w:snapToGrid/>
+        <w:spacing w:before="0" w:beforeAutospacing="0" w:line="204" w:lineRule="auto"/>
+        <w:ind w:left="-1" w:leftChars="0" w:firstLine="0" w:firstLineChars="0"/>
+        <w:textAlignment w:val="auto"/>
+        <w:rPr>
+          <w:rFonts w:hint="default" w:ascii="Bahnschrift" w:hAnsi="Bahnschrift" w:cs="Bahnschrift"/>
+        </w:rPr>
+      </w:pPr>
+      <w:r>
+        <w:rPr>
+          <w:rStyle w:val="11"/>
+          <w:rFonts w:hint="default" w:ascii="Bahnschrift" w:hAnsi="Bahnschrift" w:cs="Bahnschrift"/>
+        </w:rPr>
+        <w:t>Samantha:</w:t>
+      </w:r>
+      <w:r>
+        <w:rPr>
+          <w:rFonts w:hint="default" w:ascii="Bahnschrift" w:hAnsi="Bahnschrift" w:cs="Bahnschrift"/>
+        </w:rPr>
+        <w:t xml:space="preserve"> Social media! Everyone’s talking about it.</w:t>
+      </w:r>
+    </w:p>
+    <w:p>
+      <w:pPr>
+        <w:pStyle w:val="10"/>
+        <w:keepNext w:val="0"/>
+        <w:keepLines w:val="0"/>
+        <w:pageBreakBefore w:val="0"/>
+        <w:widowControl/>
+        <w:suppressLineNumbers w:val="0"/>
+        <w:kinsoku/>
+        <w:wordWrap/>
+        <w:overflowPunct/>
+        <w:topLinePunct w:val="0"/>
+        <w:autoSpaceDE/>
+        <w:autoSpaceDN/>
+        <w:bidi w:val="0"/>
+        <w:adjustRightInd/>
+        <w:snapToGrid/>
+        <w:spacing w:before="0" w:beforeAutospacing="0" w:line="204" w:lineRule="auto"/>
+        <w:ind w:left="-1" w:leftChars="0" w:firstLine="0" w:firstLineChars="0"/>
+        <w:textAlignment w:val="auto"/>
+        <w:rPr>
+          <w:rFonts w:hint="default" w:ascii="Bahnschrift" w:hAnsi="Bahnschrift" w:cs="Bahnschrift"/>
+        </w:rPr>
+      </w:pPr>
+      <w:r>
+        <w:rPr>
+          <w:rStyle w:val="11"/>
+          <w:rFonts w:hint="default" w:ascii="Bahnschrift" w:hAnsi="Bahnschrift" w:cs="Bahnschrift"/>
+        </w:rPr>
+        <w:t>Agent:</w:t>
+      </w:r>
+      <w:r>
+        <w:rPr>
+          <w:rFonts w:hint="default" w:ascii="Bahnschrift" w:hAnsi="Bahnschrift" w:cs="Bahnschrift"/>
+        </w:rPr>
+        <w:t xml:space="preserve"> That doesn’t make it true. Did you check the source?</w:t>
+      </w:r>
+    </w:p>
+    <w:p>
+      <w:pPr>
+        <w:pStyle w:val="10"/>
+        <w:keepNext w:val="0"/>
+        <w:keepLines w:val="0"/>
+        <w:pageBreakBefore w:val="0"/>
+        <w:widowControl/>
+        <w:suppressLineNumbers w:val="0"/>
+        <w:kinsoku/>
+        <w:wordWrap/>
+        <w:overflowPunct/>
+        <w:topLinePunct w:val="0"/>
+        <w:autoSpaceDE/>
+        <w:autoSpaceDN/>
+        <w:bidi w:val="0"/>
+        <w:adjustRightInd/>
+        <w:snapToGrid/>
+        <w:spacing w:before="0" w:beforeAutospacing="0" w:line="204" w:lineRule="auto"/>
+        <w:ind w:left="-1" w:leftChars="0" w:firstLine="0" w:firstLineChars="0"/>
+        <w:textAlignment w:val="auto"/>
+        <w:rPr>
+          <w:rFonts w:hint="default" w:ascii="Bahnschrift" w:hAnsi="Bahnschrift" w:cs="Bahnschrift"/>
+        </w:rPr>
+      </w:pPr>
+      <w:r>
+        <w:rPr>
+          <w:rStyle w:val="11"/>
+          <w:rFonts w:hint="default" w:ascii="Bahnschrift" w:hAnsi="Bahnschrift" w:cs="Bahnschrift"/>
+        </w:rPr>
+        <w:t>Samantha:</w:t>
+      </w:r>
+      <w:r>
+        <w:rPr>
+          <w:rFonts w:hint="default" w:ascii="Bahnschrift" w:hAnsi="Bahnschrift" w:cs="Bahnschrift"/>
+        </w:rPr>
+        <w:t xml:space="preserve"> Well… no, but I mean, why would people share it if it wasn’t real?</w:t>
+      </w:r>
+    </w:p>
+    <w:p>
+      <w:pPr>
+        <w:pStyle w:val="10"/>
+        <w:keepNext w:val="0"/>
+        <w:keepLines w:val="0"/>
+        <w:pageBreakBefore w:val="0"/>
+        <w:widowControl/>
+        <w:suppressLineNumbers w:val="0"/>
+        <w:kinsoku/>
+        <w:wordWrap/>
+        <w:overflowPunct/>
+        <w:topLinePunct w:val="0"/>
+        <w:autoSpaceDE/>
+        <w:autoSpaceDN/>
+        <w:bidi w:val="0"/>
+        <w:adjustRightInd/>
+        <w:snapToGrid/>
+        <w:spacing w:before="0" w:beforeAutospacing="0" w:line="204" w:lineRule="auto"/>
+        <w:ind w:left="-1" w:leftChars="0" w:firstLine="0" w:firstLineChars="0"/>
+        <w:textAlignment w:val="auto"/>
+        <w:rPr>
+          <w:rFonts w:hint="default" w:ascii="Bahnschrift" w:hAnsi="Bahnschrift" w:cs="Bahnschrift"/>
+        </w:rPr>
+      </w:pPr>
+      <w:r>
+        <w:rPr>
+          <w:rStyle w:val="11"/>
+          <w:rFonts w:hint="default" w:ascii="Bahnschrift" w:hAnsi="Bahnschrift" w:cs="Bahnschrift"/>
+        </w:rPr>
+        <w:t>Agent:</w:t>
+      </w:r>
+      <w:r>
+        <w:rPr>
+          <w:rFonts w:hint="default" w:ascii="Bahnschrift" w:hAnsi="Bahnschrift" w:cs="Bahnschrift"/>
+        </w:rPr>
+        <w:t xml:space="preserve"> Because it’s </w:t>
+      </w:r>
+      <w:r>
+        <w:rPr>
+          <w:rStyle w:val="9"/>
+          <w:rFonts w:hint="default" w:ascii="Bahnschrift" w:hAnsi="Bahnschrift" w:cs="Bahnschrift"/>
+        </w:rPr>
+        <w:t>misinformation</w:t>
+      </w:r>
+      <w:r>
+        <w:rPr>
+          <w:rFonts w:hint="default" w:ascii="Bahnschrift" w:hAnsi="Bahnschrift" w:cs="Bahnschrift"/>
+        </w:rPr>
+        <w:t>—false info that spreads because people don’t fact-check.</w:t>
+      </w:r>
+    </w:p>
+    <w:p>
+      <w:pPr>
+        <w:pStyle w:val="10"/>
+        <w:keepNext w:val="0"/>
+        <w:keepLines w:val="0"/>
+        <w:pageBreakBefore w:val="0"/>
+        <w:widowControl/>
+        <w:suppressLineNumbers w:val="0"/>
+        <w:kinsoku/>
+        <w:wordWrap/>
+        <w:overflowPunct/>
+        <w:topLinePunct w:val="0"/>
+        <w:autoSpaceDE/>
+        <w:autoSpaceDN/>
+        <w:bidi w:val="0"/>
+        <w:adjustRightInd/>
+        <w:snapToGrid/>
+        <w:spacing w:before="0" w:beforeAutospacing="0" w:line="204" w:lineRule="auto"/>
+        <w:ind w:left="-1" w:leftChars="0" w:firstLine="0" w:firstLineChars="0"/>
+        <w:textAlignment w:val="auto"/>
+        <w:rPr>
+          <w:rFonts w:hint="default" w:ascii="Bahnschrift" w:hAnsi="Bahnschrift" w:cs="Bahnschrift"/>
+        </w:rPr>
+      </w:pPr>
+      <w:r>
+        <w:rPr>
+          <w:rStyle w:val="11"/>
+          <w:rFonts w:hint="default" w:ascii="Bahnschrift" w:hAnsi="Bahnschrift" w:cs="Bahnschrift"/>
+        </w:rPr>
+        <w:t>Samantha:</w:t>
+      </w:r>
+      <w:r>
+        <w:rPr>
+          <w:rFonts w:hint="default" w:ascii="Bahnschrift" w:hAnsi="Bahnschrift" w:cs="Bahnschrift"/>
+        </w:rPr>
+        <w:t xml:space="preserve"> But it sounds real!</w:t>
+      </w:r>
+    </w:p>
+    <w:p>
+      <w:pPr>
+        <w:pStyle w:val="10"/>
+        <w:keepNext w:val="0"/>
+        <w:keepLines w:val="0"/>
+        <w:pageBreakBefore w:val="0"/>
+        <w:widowControl/>
+        <w:suppressLineNumbers w:val="0"/>
+        <w:kinsoku/>
+        <w:wordWrap/>
+        <w:overflowPunct/>
+        <w:topLinePunct w:val="0"/>
+        <w:autoSpaceDE/>
+        <w:autoSpaceDN/>
+        <w:bidi w:val="0"/>
+        <w:adjustRightInd/>
+        <w:snapToGrid/>
+        <w:spacing w:before="0" w:beforeAutospacing="0" w:line="204" w:lineRule="auto"/>
+        <w:ind w:left="-1" w:leftChars="0" w:firstLine="0" w:firstLineChars="0"/>
+        <w:textAlignment w:val="auto"/>
+        <w:rPr>
+          <w:rFonts w:hint="default" w:ascii="Bahnschrift" w:hAnsi="Bahnschrift" w:cs="Bahnschrift"/>
+        </w:rPr>
+      </w:pPr>
+      <w:r>
+        <w:rPr>
+          <w:rStyle w:val="11"/>
+          <w:rFonts w:hint="default" w:ascii="Bahnschrift" w:hAnsi="Bahnschrift" w:cs="Bahnschrift"/>
+        </w:rPr>
+        <w:t>Agent:</w:t>
+      </w:r>
+      <w:r>
+        <w:rPr>
+          <w:rFonts w:hint="default" w:ascii="Bahnschrift" w:hAnsi="Bahnschrift" w:cs="Bahnschrift"/>
+        </w:rPr>
+        <w:t xml:space="preserve"> That’s how misinformation works. It plays on what you </w:t>
+      </w:r>
+      <w:r>
+        <w:rPr>
+          <w:rStyle w:val="9"/>
+          <w:rFonts w:hint="default" w:ascii="Bahnschrift" w:hAnsi="Bahnschrift" w:cs="Bahnschrift"/>
+        </w:rPr>
+        <w:t>want</w:t>
+      </w:r>
+      <w:r>
+        <w:rPr>
+          <w:rFonts w:hint="default" w:ascii="Bahnschrift" w:hAnsi="Bahnschrift" w:cs="Bahnschrift"/>
+        </w:rPr>
+        <w:t xml:space="preserve"> to believe. If it confirms your opinions, you’re more likely to share it without questioning it.</w:t>
+      </w:r>
+    </w:p>
+    <w:p>
+      <w:pPr>
+        <w:pStyle w:val="10"/>
+        <w:keepNext w:val="0"/>
+        <w:keepLines w:val="0"/>
+        <w:pageBreakBefore w:val="0"/>
+        <w:widowControl/>
+        <w:suppressLineNumbers w:val="0"/>
+        <w:kinsoku/>
+        <w:wordWrap/>
+        <w:overflowPunct/>
+        <w:topLinePunct w:val="0"/>
+        <w:autoSpaceDE/>
+        <w:autoSpaceDN/>
+        <w:bidi w:val="0"/>
+        <w:adjustRightInd/>
+        <w:snapToGrid/>
+        <w:spacing w:before="0" w:beforeAutospacing="0" w:line="204" w:lineRule="auto"/>
+        <w:ind w:left="-1" w:leftChars="0" w:firstLine="0" w:firstLineChars="0"/>
+        <w:textAlignment w:val="auto"/>
+        <w:rPr>
+          <w:rFonts w:hint="default" w:ascii="Bahnschrift" w:hAnsi="Bahnschrift" w:cs="Bahnschrift"/>
+        </w:rPr>
+      </w:pPr>
+      <w:r>
+        <w:rPr>
+          <w:rStyle w:val="11"/>
+          <w:rFonts w:hint="default" w:ascii="Bahnschrift" w:hAnsi="Bahnschrift" w:cs="Bahnschrift"/>
+        </w:rPr>
+        <w:t>Samantha:</w:t>
+      </w:r>
+      <w:r>
+        <w:rPr>
+          <w:rFonts w:hint="default" w:ascii="Bahnschrift" w:hAnsi="Bahnschrift" w:cs="Bahnschrift"/>
+        </w:rPr>
+        <w:t xml:space="preserve"> …Wait, so this might not be true?</w:t>
+      </w:r>
+    </w:p>
+    <w:p>
+      <w:pPr>
+        <w:pStyle w:val="10"/>
+        <w:keepNext w:val="0"/>
+        <w:keepLines w:val="0"/>
+        <w:pageBreakBefore w:val="0"/>
+        <w:widowControl/>
+        <w:suppressLineNumbers w:val="0"/>
+        <w:kinsoku/>
+        <w:wordWrap/>
+        <w:overflowPunct/>
+        <w:topLinePunct w:val="0"/>
+        <w:autoSpaceDE/>
+        <w:autoSpaceDN/>
+        <w:bidi w:val="0"/>
+        <w:adjustRightInd/>
+        <w:snapToGrid/>
+        <w:spacing w:before="0" w:beforeAutospacing="0" w:line="204" w:lineRule="auto"/>
+        <w:ind w:left="-1" w:leftChars="0" w:firstLine="0" w:firstLineChars="0"/>
+        <w:textAlignment w:val="auto"/>
+        <w:rPr>
+          <w:rFonts w:hint="default" w:ascii="Bahnschrift" w:hAnsi="Bahnschrift" w:cs="Bahnschrift"/>
+        </w:rPr>
+      </w:pPr>
+      <w:r>
+        <w:rPr>
+          <w:rStyle w:val="11"/>
+          <w:rFonts w:hint="default" w:ascii="Bahnschrift" w:hAnsi="Bahnschrift" w:cs="Bahnschrift"/>
+        </w:rPr>
+        <w:t>Agent:</w:t>
+      </w:r>
+      <w:r>
+        <w:rPr>
+          <w:rFonts w:hint="default" w:ascii="Bahnschrift" w:hAnsi="Bahnschrift" w:cs="Bahnschrift"/>
+        </w:rPr>
+        <w:t xml:space="preserve"> Let’s check. Look at the website that posted it—does it have any sources? Do other </w:t>
+      </w:r>
+      <w:r>
+        <w:rPr>
+          <w:rStyle w:val="9"/>
+          <w:rFonts w:hint="default" w:ascii="Bahnschrift" w:hAnsi="Bahnschrift" w:cs="Bahnschrift"/>
+        </w:rPr>
+        <w:t>trusted</w:t>
+      </w:r>
+      <w:r>
+        <w:rPr>
+          <w:rFonts w:hint="default" w:ascii="Bahnschrift" w:hAnsi="Bahnschrift" w:cs="Bahnschrift"/>
+        </w:rPr>
+        <w:t xml:space="preserve"> sites report the same thing?</w:t>
+      </w:r>
+    </w:p>
+    <w:p>
+      <w:pPr>
+        <w:pStyle w:val="10"/>
+        <w:keepNext w:val="0"/>
+        <w:keepLines w:val="0"/>
+        <w:pageBreakBefore w:val="0"/>
+        <w:widowControl/>
+        <w:suppressLineNumbers w:val="0"/>
+        <w:kinsoku/>
+        <w:wordWrap/>
+        <w:overflowPunct/>
+        <w:topLinePunct w:val="0"/>
+        <w:autoSpaceDE/>
+        <w:autoSpaceDN/>
+        <w:bidi w:val="0"/>
+        <w:adjustRightInd/>
+        <w:snapToGrid/>
+        <w:spacing w:before="0" w:beforeAutospacing="0" w:line="204" w:lineRule="auto"/>
+        <w:ind w:left="-1" w:leftChars="0" w:firstLine="0" w:firstLineChars="0"/>
+        <w:textAlignment w:val="auto"/>
+        <w:rPr>
+          <w:rFonts w:hint="default" w:ascii="Bahnschrift" w:hAnsi="Bahnschrift" w:cs="Bahnschrift"/>
+        </w:rPr>
+      </w:pPr>
+      <w:r>
+        <w:rPr>
+          <w:rStyle w:val="9"/>
+          <w:rFonts w:hint="default" w:ascii="Bahnschrift" w:hAnsi="Bahnschrift" w:cs="Bahnschrift"/>
+        </w:rPr>
+        <w:t>Samantha quickly scrolls and frowns.</w:t>
+      </w:r>
+    </w:p>
+    <w:p>
+      <w:pPr>
+        <w:pStyle w:val="10"/>
+        <w:keepNext w:val="0"/>
+        <w:keepLines w:val="0"/>
+        <w:pageBreakBefore w:val="0"/>
+        <w:widowControl/>
+        <w:suppressLineNumbers w:val="0"/>
+        <w:kinsoku/>
+        <w:wordWrap/>
+        <w:overflowPunct/>
+        <w:topLinePunct w:val="0"/>
+        <w:autoSpaceDE/>
+        <w:autoSpaceDN/>
+        <w:bidi w:val="0"/>
+        <w:adjustRightInd/>
+        <w:snapToGrid/>
+        <w:spacing w:before="0" w:beforeAutospacing="0" w:line="204" w:lineRule="auto"/>
+        <w:ind w:left="-1" w:leftChars="0" w:firstLine="0" w:firstLineChars="0"/>
+        <w:textAlignment w:val="auto"/>
+        <w:rPr>
+          <w:rFonts w:hint="default" w:ascii="Bahnschrift" w:hAnsi="Bahnschrift" w:cs="Bahnschrift"/>
+        </w:rPr>
+      </w:pPr>
+      <w:r>
+        <w:rPr>
+          <w:rStyle w:val="11"/>
+          <w:rFonts w:hint="default" w:ascii="Bahnschrift" w:hAnsi="Bahnschrift" w:cs="Bahnschrift"/>
+        </w:rPr>
+        <w:t>Samantha:</w:t>
+      </w:r>
+      <w:r>
+        <w:rPr>
+          <w:rFonts w:hint="default" w:ascii="Bahnschrift" w:hAnsi="Bahnschrift" w:cs="Bahnschrift"/>
+        </w:rPr>
+        <w:t xml:space="preserve"> Ugh. This article just links to other sketchy sites.</w:t>
+      </w:r>
+    </w:p>
+    <w:p>
+      <w:pPr>
+        <w:pStyle w:val="10"/>
+        <w:keepNext w:val="0"/>
+        <w:keepLines w:val="0"/>
+        <w:pageBreakBefore w:val="0"/>
+        <w:widowControl/>
+        <w:suppressLineNumbers w:val="0"/>
+        <w:kinsoku/>
+        <w:wordWrap/>
+        <w:overflowPunct/>
+        <w:topLinePunct w:val="0"/>
+        <w:autoSpaceDE/>
+        <w:autoSpaceDN/>
+        <w:bidi w:val="0"/>
+        <w:adjustRightInd/>
+        <w:snapToGrid/>
+        <w:spacing w:before="0" w:beforeAutospacing="0" w:line="204" w:lineRule="auto"/>
+        <w:ind w:left="-1" w:leftChars="0" w:firstLine="0" w:firstLineChars="0"/>
+        <w:textAlignment w:val="auto"/>
+        <w:rPr>
+          <w:rFonts w:hint="default" w:ascii="Bahnschrift" w:hAnsi="Bahnschrift" w:cs="Bahnschrift"/>
+        </w:rPr>
+      </w:pPr>
+      <w:r>
+        <w:rPr>
+          <w:rStyle w:val="11"/>
+          <w:rFonts w:hint="default" w:ascii="Bahnschrift" w:hAnsi="Bahnschrift" w:cs="Bahnschrift"/>
+        </w:rPr>
+        <w:t>Agent:</w:t>
+      </w:r>
+      <w:r>
+        <w:rPr>
+          <w:rFonts w:hint="default" w:ascii="Bahnschrift" w:hAnsi="Bahnschrift" w:cs="Bahnschrift"/>
+        </w:rPr>
+        <w:t xml:space="preserve"> Classic misinformation trap—fake stories linking to other fake stories to seem legit.</w:t>
+      </w:r>
+    </w:p>
+    <w:p>
+      <w:pPr>
+        <w:pStyle w:val="10"/>
+        <w:keepNext w:val="0"/>
+        <w:keepLines w:val="0"/>
+        <w:pageBreakBefore w:val="0"/>
+        <w:widowControl/>
+        <w:suppressLineNumbers w:val="0"/>
+        <w:kinsoku/>
+        <w:wordWrap/>
+        <w:overflowPunct/>
+        <w:topLinePunct w:val="0"/>
+        <w:autoSpaceDE/>
+        <w:autoSpaceDN/>
+        <w:bidi w:val="0"/>
+        <w:adjustRightInd/>
+        <w:snapToGrid/>
+        <w:spacing w:before="0" w:beforeAutospacing="0" w:line="204" w:lineRule="auto"/>
+        <w:ind w:left="-1" w:leftChars="0" w:firstLine="0" w:firstLineChars="0"/>
+        <w:textAlignment w:val="auto"/>
+        <w:rPr>
+          <w:rFonts w:hint="default" w:ascii="Bahnschrift" w:hAnsi="Bahnschrift" w:cs="Bahnschrift"/>
+        </w:rPr>
+      </w:pPr>
+      <w:r>
+        <w:rPr>
+          <w:rStyle w:val="11"/>
+          <w:rFonts w:hint="default" w:ascii="Bahnschrift" w:hAnsi="Bahnschrift" w:cs="Bahnschrift"/>
+        </w:rPr>
+        <w:t>Samantha:</w:t>
+      </w:r>
+      <w:r>
+        <w:rPr>
+          <w:rFonts w:hint="default" w:ascii="Bahnschrift" w:hAnsi="Bahnschrift" w:cs="Bahnschrift"/>
+        </w:rPr>
+        <w:t xml:space="preserve"> </w:t>
+      </w:r>
+      <w:r>
+        <w:rPr>
+          <w:rStyle w:val="9"/>
+          <w:rFonts w:hint="default" w:ascii="Bahnschrift" w:hAnsi="Bahnschrift" w:cs="Bahnschrift"/>
+        </w:rPr>
+        <w:t>[groans]</w:t>
+      </w:r>
+      <w:r>
+        <w:rPr>
+          <w:rFonts w:hint="default" w:ascii="Bahnschrift" w:hAnsi="Bahnschrift" w:cs="Bahnschrift"/>
+        </w:rPr>
+        <w:t xml:space="preserve"> Great. And I already shared it.</w:t>
+      </w:r>
+    </w:p>
+    <w:p>
+      <w:pPr>
+        <w:pStyle w:val="10"/>
+        <w:keepNext w:val="0"/>
+        <w:keepLines w:val="0"/>
+        <w:pageBreakBefore w:val="0"/>
+        <w:widowControl/>
+        <w:suppressLineNumbers w:val="0"/>
+        <w:kinsoku/>
+        <w:wordWrap/>
+        <w:overflowPunct/>
+        <w:topLinePunct w:val="0"/>
+        <w:autoSpaceDE/>
+        <w:autoSpaceDN/>
+        <w:bidi w:val="0"/>
+        <w:adjustRightInd/>
+        <w:snapToGrid/>
+        <w:spacing w:before="0" w:beforeAutospacing="0" w:line="204" w:lineRule="auto"/>
+        <w:ind w:left="-1" w:leftChars="0" w:firstLine="0" w:firstLineChars="0"/>
+        <w:textAlignment w:val="auto"/>
+        <w:rPr>
+          <w:rFonts w:hint="default" w:ascii="Bahnschrift" w:hAnsi="Bahnschrift" w:cs="Bahnschrift"/>
+        </w:rPr>
+      </w:pPr>
+      <w:r>
+        <w:rPr>
+          <w:rStyle w:val="11"/>
+          <w:rFonts w:hint="default" w:ascii="Bahnschrift" w:hAnsi="Bahnschrift" w:cs="Bahnschrift"/>
+        </w:rPr>
+        <w:t>Agent:</w:t>
+      </w:r>
+      <w:r>
+        <w:rPr>
+          <w:rFonts w:hint="default" w:ascii="Bahnschrift" w:hAnsi="Bahnschrift" w:cs="Bahnschrift"/>
+        </w:rPr>
+        <w:t xml:space="preserve"> It happens. The best thing you can do? Delete it and correct it. Let people know it’s false.</w:t>
+      </w:r>
+    </w:p>
+    <w:p>
+      <w:pPr>
+        <w:pStyle w:val="10"/>
+        <w:keepNext w:val="0"/>
+        <w:keepLines w:val="0"/>
+        <w:pageBreakBefore w:val="0"/>
+        <w:widowControl/>
+        <w:suppressLineNumbers w:val="0"/>
+        <w:kinsoku/>
+        <w:wordWrap/>
+        <w:overflowPunct/>
+        <w:topLinePunct w:val="0"/>
+        <w:autoSpaceDE/>
+        <w:autoSpaceDN/>
+        <w:bidi w:val="0"/>
+        <w:adjustRightInd/>
+        <w:snapToGrid/>
+        <w:spacing w:before="0" w:beforeAutospacing="0" w:line="204" w:lineRule="auto"/>
+        <w:ind w:left="-1" w:leftChars="0" w:firstLine="0" w:firstLineChars="0"/>
+        <w:textAlignment w:val="auto"/>
+        <w:rPr>
+          <w:rFonts w:hint="default" w:ascii="Bahnschrift" w:hAnsi="Bahnschrift" w:cs="Bahnschrift"/>
+        </w:rPr>
+      </w:pPr>
+      <w:r>
+        <w:rPr>
+          <w:rStyle w:val="11"/>
+          <w:rFonts w:hint="default" w:ascii="Bahnschrift" w:hAnsi="Bahnschrift" w:cs="Bahnschrift"/>
+        </w:rPr>
+        <w:t>Samantha:</w:t>
+      </w:r>
+      <w:r>
+        <w:rPr>
+          <w:rFonts w:hint="default" w:ascii="Bahnschrift" w:hAnsi="Bahnschrift" w:cs="Bahnschrift"/>
+        </w:rPr>
+        <w:t xml:space="preserve"> Yeah… I should. No way I wanna be part of spreading lies. Thanks for calling me out.</w:t>
+      </w:r>
+    </w:p>
+    <w:p>
+      <w:pPr>
+        <w:keepNext w:val="0"/>
+        <w:keepLines w:val="0"/>
+        <w:pageBreakBefore w:val="0"/>
+        <w:widowControl/>
+        <w:suppressLineNumbers w:val="0"/>
+        <w:kinsoku/>
+        <w:wordWrap/>
+        <w:overflowPunct/>
+        <w:topLinePunct w:val="0"/>
+        <w:autoSpaceDE/>
+        <w:autoSpaceDN/>
+        <w:bidi w:val="0"/>
+        <w:adjustRightInd/>
+        <w:snapToGrid/>
+        <w:spacing w:before="0" w:beforeAutospacing="0" w:line="204" w:lineRule="auto"/>
+        <w:ind w:left="-1" w:leftChars="0" w:firstLine="0" w:firstLineChars="0"/>
+        <w:textAlignment w:val="auto"/>
+        <w:rPr>
+          <w:rFonts w:hint="default" w:ascii="Bahnschrift" w:hAnsi="Bahnschrift" w:cs="Bahnschrift"/>
+        </w:rPr>
+      </w:pPr>
+    </w:p>
+    <w:p>
+      <w:pPr>
+        <w:pStyle w:val="4"/>
+        <w:keepNext w:val="0"/>
+        <w:keepLines w:val="0"/>
+        <w:pageBreakBefore w:val="0"/>
+        <w:widowControl/>
+        <w:suppressLineNumbers w:val="0"/>
+        <w:kinsoku/>
+        <w:wordWrap/>
+        <w:overflowPunct/>
+        <w:topLinePunct w:val="0"/>
+        <w:autoSpaceDE/>
+        <w:autoSpaceDN/>
+        <w:bidi w:val="0"/>
+        <w:adjustRightInd/>
+        <w:snapToGrid/>
+        <w:spacing w:before="0" w:beforeAutospacing="0" w:line="204" w:lineRule="auto"/>
+        <w:ind w:left="-1" w:leftChars="0" w:firstLine="0" w:firstLineChars="0"/>
+        <w:textAlignment w:val="auto"/>
+        <w:rPr>
+          <w:rFonts w:hint="default" w:ascii="Bahnschrift" w:hAnsi="Bahnschrift" w:cs="Bahnschrift"/>
+          <w:sz w:val="24"/>
+          <w:szCs w:val="24"/>
+          <w:u w:val="single"/>
+        </w:rPr>
+      </w:pPr>
+      <w:r>
+        <w:rPr>
+          <w:rStyle w:val="11"/>
+          <w:rFonts w:hint="default" w:ascii="Bahnschrift" w:hAnsi="Bahnschrift" w:cs="Bahnschrift"/>
+          <w:b/>
+          <w:bCs/>
+          <w:sz w:val="24"/>
+          <w:szCs w:val="24"/>
+          <w:u w:val="single"/>
+        </w:rPr>
+        <w:t>NPC3 – Vinc</w:t>
+      </w:r>
+      <w:r>
+        <w:rPr>
+          <w:rStyle w:val="11"/>
+          <w:rFonts w:hint="default" w:ascii="Bahnschrift" w:hAnsi="Bahnschrift" w:cs="Bahnschrift"/>
+          <w:b/>
+          <w:bCs/>
+          <w:sz w:val="24"/>
+          <w:szCs w:val="24"/>
+          <w:u w:val="single"/>
+          <w:lang w:val="en-US"/>
+        </w:rPr>
+        <w:t>e</w:t>
+      </w:r>
+      <w:r>
+        <w:rPr>
+          <w:rStyle w:val="11"/>
+          <w:rFonts w:hint="default" w:ascii="Bahnschrift" w:hAnsi="Bahnschrift" w:cs="Bahnschrift"/>
+          <w:b/>
+          <w:bCs/>
+          <w:sz w:val="24"/>
+          <w:szCs w:val="24"/>
+          <w:u w:val="single"/>
+        </w:rPr>
+        <w:t xml:space="preserve"> (Deliberate Spreader)</w:t>
+      </w:r>
+    </w:p>
+    <w:p>
+      <w:pPr>
+        <w:pStyle w:val="10"/>
+        <w:keepNext w:val="0"/>
+        <w:keepLines w:val="0"/>
+        <w:pageBreakBefore w:val="0"/>
+        <w:widowControl/>
+        <w:suppressLineNumbers w:val="0"/>
+        <w:kinsoku/>
+        <w:wordWrap/>
+        <w:overflowPunct/>
+        <w:topLinePunct w:val="0"/>
+        <w:autoSpaceDE/>
+        <w:autoSpaceDN/>
+        <w:bidi w:val="0"/>
+        <w:adjustRightInd/>
+        <w:snapToGrid/>
+        <w:spacing w:before="0" w:beforeAutospacing="0" w:line="204" w:lineRule="auto"/>
+        <w:ind w:left="-1" w:leftChars="0" w:firstLine="0" w:firstLineChars="0"/>
+        <w:textAlignment w:val="auto"/>
+        <w:rPr>
+          <w:rFonts w:hint="default" w:ascii="Bahnschrift" w:hAnsi="Bahnschrift" w:cs="Bahnschrift"/>
+        </w:rPr>
+      </w:pPr>
+      <w:r>
+        <w:rPr>
+          <w:rStyle w:val="9"/>
+          <w:rFonts w:hint="default" w:ascii="Bahnschrift" w:hAnsi="Bahnschrift" w:cs="Bahnschrift"/>
+        </w:rPr>
+        <w:t>Vince leans against a wall, smirking as the player approaches.</w:t>
+      </w:r>
+    </w:p>
+    <w:p>
+      <w:pPr>
+        <w:pStyle w:val="10"/>
+        <w:keepNext w:val="0"/>
+        <w:keepLines w:val="0"/>
+        <w:pageBreakBefore w:val="0"/>
+        <w:widowControl/>
+        <w:suppressLineNumbers w:val="0"/>
+        <w:kinsoku/>
+        <w:wordWrap/>
+        <w:overflowPunct/>
+        <w:topLinePunct w:val="0"/>
+        <w:autoSpaceDE/>
+        <w:autoSpaceDN/>
+        <w:bidi w:val="0"/>
+        <w:adjustRightInd/>
+        <w:snapToGrid/>
+        <w:spacing w:before="0" w:beforeAutospacing="0" w:line="204" w:lineRule="auto"/>
+        <w:ind w:left="-1" w:leftChars="0" w:firstLine="0" w:firstLineChars="0"/>
+        <w:textAlignment w:val="auto"/>
+        <w:rPr>
+          <w:rFonts w:hint="default" w:ascii="Bahnschrift" w:hAnsi="Bahnschrift" w:cs="Bahnschrift"/>
+        </w:rPr>
+      </w:pPr>
+      <w:r>
+        <w:rPr>
+          <w:rStyle w:val="11"/>
+          <w:rFonts w:hint="default" w:ascii="Bahnschrift" w:hAnsi="Bahnschrift" w:cs="Bahnschrift"/>
+        </w:rPr>
+        <w:t>Vince:</w:t>
+      </w:r>
+      <w:r>
+        <w:rPr>
+          <w:rFonts w:hint="default" w:ascii="Bahnschrift" w:hAnsi="Bahnschrift" w:cs="Bahnschrift"/>
+        </w:rPr>
+        <w:t xml:space="preserve"> If it isn’t the truth patrol. What, here to give me a lecture?</w:t>
+      </w:r>
+    </w:p>
+    <w:p>
+      <w:pPr>
+        <w:pStyle w:val="10"/>
+        <w:keepNext w:val="0"/>
+        <w:keepLines w:val="0"/>
+        <w:pageBreakBefore w:val="0"/>
+        <w:widowControl/>
+        <w:suppressLineNumbers w:val="0"/>
+        <w:kinsoku/>
+        <w:wordWrap/>
+        <w:overflowPunct/>
+        <w:topLinePunct w:val="0"/>
+        <w:autoSpaceDE/>
+        <w:autoSpaceDN/>
+        <w:bidi w:val="0"/>
+        <w:adjustRightInd/>
+        <w:snapToGrid/>
+        <w:spacing w:before="0" w:beforeAutospacing="0" w:line="204" w:lineRule="auto"/>
+        <w:ind w:left="-1" w:leftChars="0" w:firstLine="0" w:firstLineChars="0"/>
+        <w:textAlignment w:val="auto"/>
+        <w:rPr>
+          <w:rFonts w:hint="default" w:ascii="Bahnschrift" w:hAnsi="Bahnschrift" w:cs="Bahnschrift"/>
+        </w:rPr>
+      </w:pPr>
+      <w:r>
+        <w:rPr>
+          <w:rStyle w:val="11"/>
+          <w:rFonts w:hint="default" w:ascii="Bahnschrift" w:hAnsi="Bahnschrift" w:cs="Bahnschrift"/>
+        </w:rPr>
+        <w:t>Agent:</w:t>
+      </w:r>
+      <w:r>
+        <w:rPr>
+          <w:rFonts w:hint="default" w:ascii="Bahnschrift" w:hAnsi="Bahnschrift" w:cs="Bahnschrift"/>
+        </w:rPr>
+        <w:t xml:space="preserve"> More like a reality check. You know the stuff you’re posting is fake.</w:t>
+      </w:r>
+    </w:p>
+    <w:p>
+      <w:pPr>
+        <w:pStyle w:val="10"/>
+        <w:keepNext w:val="0"/>
+        <w:keepLines w:val="0"/>
+        <w:pageBreakBefore w:val="0"/>
+        <w:widowControl/>
+        <w:suppressLineNumbers w:val="0"/>
+        <w:kinsoku/>
+        <w:wordWrap/>
+        <w:overflowPunct/>
+        <w:topLinePunct w:val="0"/>
+        <w:autoSpaceDE/>
+        <w:autoSpaceDN/>
+        <w:bidi w:val="0"/>
+        <w:adjustRightInd/>
+        <w:snapToGrid/>
+        <w:spacing w:before="0" w:beforeAutospacing="0" w:line="204" w:lineRule="auto"/>
+        <w:ind w:left="-1" w:leftChars="0" w:firstLine="0" w:firstLineChars="0"/>
+        <w:textAlignment w:val="auto"/>
+        <w:rPr>
+          <w:rFonts w:hint="default" w:ascii="Bahnschrift" w:hAnsi="Bahnschrift" w:cs="Bahnschrift"/>
+        </w:rPr>
+      </w:pPr>
+      <w:r>
+        <w:rPr>
+          <w:rStyle w:val="11"/>
+          <w:rFonts w:hint="default" w:ascii="Bahnschrift" w:hAnsi="Bahnschrift" w:cs="Bahnschrift"/>
+        </w:rPr>
+        <w:t>Vince:</w:t>
+      </w:r>
+      <w:r>
+        <w:rPr>
+          <w:rFonts w:hint="default" w:ascii="Bahnschrift" w:hAnsi="Bahnschrift" w:cs="Bahnschrift"/>
+        </w:rPr>
+        <w:t xml:space="preserve"> And? It gets clicks. People love drama. The Mayor wins, and I get my cut.</w:t>
+      </w:r>
+    </w:p>
+    <w:p>
+      <w:pPr>
+        <w:pStyle w:val="10"/>
+        <w:keepNext w:val="0"/>
+        <w:keepLines w:val="0"/>
+        <w:pageBreakBefore w:val="0"/>
+        <w:widowControl/>
+        <w:suppressLineNumbers w:val="0"/>
+        <w:kinsoku/>
+        <w:wordWrap/>
+        <w:overflowPunct/>
+        <w:topLinePunct w:val="0"/>
+        <w:autoSpaceDE/>
+        <w:autoSpaceDN/>
+        <w:bidi w:val="0"/>
+        <w:adjustRightInd/>
+        <w:snapToGrid/>
+        <w:spacing w:before="0" w:beforeAutospacing="0" w:line="204" w:lineRule="auto"/>
+        <w:ind w:left="-1" w:leftChars="0" w:firstLine="0" w:firstLineChars="0"/>
+        <w:textAlignment w:val="auto"/>
+        <w:rPr>
+          <w:rFonts w:hint="default" w:ascii="Bahnschrift" w:hAnsi="Bahnschrift" w:cs="Bahnschrift"/>
+        </w:rPr>
+      </w:pPr>
+      <w:r>
+        <w:rPr>
+          <w:rStyle w:val="11"/>
+          <w:rFonts w:hint="default" w:ascii="Bahnschrift" w:hAnsi="Bahnschrift" w:cs="Bahnschrift"/>
+        </w:rPr>
+        <w:t>Agent:</w:t>
+      </w:r>
+      <w:r>
+        <w:rPr>
+          <w:rFonts w:hint="default" w:ascii="Bahnschrift" w:hAnsi="Bahnschrift" w:cs="Bahnschrift"/>
+        </w:rPr>
+        <w:t xml:space="preserve"> So you </w:t>
+      </w:r>
+      <w:r>
+        <w:rPr>
+          <w:rStyle w:val="9"/>
+          <w:rFonts w:hint="default" w:ascii="Bahnschrift" w:hAnsi="Bahnschrift" w:cs="Bahnschrift"/>
+        </w:rPr>
+        <w:t>know</w:t>
+      </w:r>
+      <w:r>
+        <w:rPr>
+          <w:rFonts w:hint="default" w:ascii="Bahnschrift" w:hAnsi="Bahnschrift" w:cs="Bahnschrift"/>
+        </w:rPr>
+        <w:t xml:space="preserve"> it’s fake, but you’re posting it anyway? That’s </w:t>
+      </w:r>
+      <w:r>
+        <w:rPr>
+          <w:rStyle w:val="9"/>
+          <w:rFonts w:hint="default" w:ascii="Bahnschrift" w:hAnsi="Bahnschrift" w:cs="Bahnschrift"/>
+        </w:rPr>
+        <w:t>disinformation</w:t>
+      </w:r>
+      <w:r>
+        <w:rPr>
+          <w:rFonts w:hint="default" w:ascii="Bahnschrift" w:hAnsi="Bahnschrift" w:cs="Bahnschrift"/>
+        </w:rPr>
+        <w:t>.</w:t>
+      </w:r>
+    </w:p>
+    <w:p>
+      <w:pPr>
+        <w:pStyle w:val="10"/>
+        <w:keepNext w:val="0"/>
+        <w:keepLines w:val="0"/>
+        <w:pageBreakBefore w:val="0"/>
+        <w:widowControl/>
+        <w:suppressLineNumbers w:val="0"/>
+        <w:kinsoku/>
+        <w:wordWrap/>
+        <w:overflowPunct/>
+        <w:topLinePunct w:val="0"/>
+        <w:autoSpaceDE/>
+        <w:autoSpaceDN/>
+        <w:bidi w:val="0"/>
+        <w:adjustRightInd/>
+        <w:snapToGrid/>
+        <w:spacing w:before="0" w:beforeAutospacing="0" w:line="204" w:lineRule="auto"/>
+        <w:ind w:left="-1" w:leftChars="0" w:firstLine="0" w:firstLineChars="0"/>
+        <w:textAlignment w:val="auto"/>
+        <w:rPr>
+          <w:rFonts w:hint="default" w:ascii="Bahnschrift" w:hAnsi="Bahnschrift" w:cs="Bahnschrift"/>
+        </w:rPr>
+      </w:pPr>
+      <w:r>
+        <w:rPr>
+          <w:rStyle w:val="11"/>
+          <w:rFonts w:hint="default" w:ascii="Bahnschrift" w:hAnsi="Bahnschrift" w:cs="Bahnschrift"/>
+        </w:rPr>
+        <w:t>Vince:</w:t>
+      </w:r>
+      <w:r>
+        <w:rPr>
+          <w:rFonts w:hint="default" w:ascii="Bahnschrift" w:hAnsi="Bahnschrift" w:cs="Bahnschrift"/>
+        </w:rPr>
+        <w:t xml:space="preserve"> </w:t>
+      </w:r>
+      <w:r>
+        <w:rPr>
+          <w:rStyle w:val="9"/>
+          <w:rFonts w:hint="default" w:ascii="Bahnschrift" w:hAnsi="Bahnschrift" w:cs="Bahnschrift"/>
+        </w:rPr>
+        <w:t>[grins]</w:t>
+      </w:r>
+      <w:r>
+        <w:rPr>
+          <w:rFonts w:hint="default" w:ascii="Bahnschrift" w:hAnsi="Bahnschrift" w:cs="Bahnschrift"/>
+        </w:rPr>
+        <w:t xml:space="preserve"> Call it what you want. It works.</w:t>
+      </w:r>
+    </w:p>
+    <w:p>
+      <w:pPr>
+        <w:pStyle w:val="10"/>
+        <w:keepNext w:val="0"/>
+        <w:keepLines w:val="0"/>
+        <w:pageBreakBefore w:val="0"/>
+        <w:widowControl/>
+        <w:suppressLineNumbers w:val="0"/>
+        <w:kinsoku/>
+        <w:wordWrap/>
+        <w:overflowPunct/>
+        <w:topLinePunct w:val="0"/>
+        <w:autoSpaceDE/>
+        <w:autoSpaceDN/>
+        <w:bidi w:val="0"/>
+        <w:adjustRightInd/>
+        <w:snapToGrid/>
+        <w:spacing w:before="0" w:beforeAutospacing="0" w:line="204" w:lineRule="auto"/>
+        <w:ind w:left="-1" w:leftChars="0" w:firstLine="0" w:firstLineChars="0"/>
+        <w:textAlignment w:val="auto"/>
+        <w:rPr>
+          <w:rFonts w:hint="default" w:ascii="Bahnschrift" w:hAnsi="Bahnschrift" w:cs="Bahnschrift"/>
+        </w:rPr>
+      </w:pPr>
+      <w:r>
+        <w:rPr>
+          <w:rStyle w:val="11"/>
+          <w:rFonts w:hint="default" w:ascii="Bahnschrift" w:hAnsi="Bahnschrift" w:cs="Bahnschrift"/>
+        </w:rPr>
+        <w:t>Agent:</w:t>
+      </w:r>
+      <w:r>
+        <w:rPr>
+          <w:rFonts w:hint="default" w:ascii="Bahnschrift" w:hAnsi="Bahnschrift" w:cs="Bahnschrift"/>
+        </w:rPr>
+        <w:t xml:space="preserve"> Works for who? Because the people believing your lies? They’re the ones who lose.</w:t>
+      </w:r>
+    </w:p>
+    <w:p>
+      <w:pPr>
+        <w:pStyle w:val="10"/>
+        <w:keepNext w:val="0"/>
+        <w:keepLines w:val="0"/>
+        <w:pageBreakBefore w:val="0"/>
+        <w:widowControl/>
+        <w:suppressLineNumbers w:val="0"/>
+        <w:kinsoku/>
+        <w:wordWrap/>
+        <w:overflowPunct/>
+        <w:topLinePunct w:val="0"/>
+        <w:autoSpaceDE/>
+        <w:autoSpaceDN/>
+        <w:bidi w:val="0"/>
+        <w:adjustRightInd/>
+        <w:snapToGrid/>
+        <w:spacing w:before="0" w:beforeAutospacing="0" w:line="204" w:lineRule="auto"/>
+        <w:ind w:left="-1" w:leftChars="0" w:firstLine="0" w:firstLineChars="0"/>
+        <w:textAlignment w:val="auto"/>
+        <w:rPr>
+          <w:rFonts w:hint="default" w:ascii="Bahnschrift" w:hAnsi="Bahnschrift" w:cs="Bahnschrift"/>
+        </w:rPr>
+      </w:pPr>
+      <w:r>
+        <w:rPr>
+          <w:rStyle w:val="11"/>
+          <w:rFonts w:hint="default" w:ascii="Bahnschrift" w:hAnsi="Bahnschrift" w:cs="Bahnschrift"/>
+        </w:rPr>
+        <w:t>Vince:</w:t>
+      </w:r>
+      <w:r>
+        <w:rPr>
+          <w:rFonts w:hint="default" w:ascii="Bahnschrift" w:hAnsi="Bahnschrift" w:cs="Bahnschrift"/>
+        </w:rPr>
+        <w:t xml:space="preserve"> </w:t>
+      </w:r>
+      <w:r>
+        <w:rPr>
+          <w:rStyle w:val="9"/>
+          <w:rFonts w:hint="default" w:ascii="Bahnschrift" w:hAnsi="Bahnschrift" w:cs="Bahnschrift"/>
+        </w:rPr>
+        <w:t>[shrugs]</w:t>
+      </w:r>
+      <w:r>
+        <w:rPr>
+          <w:rFonts w:hint="default" w:ascii="Bahnschrift" w:hAnsi="Bahnschrift" w:cs="Bahnschrift"/>
+        </w:rPr>
+        <w:t xml:space="preserve"> They should fact-check. Not my problem.</w:t>
+      </w:r>
+    </w:p>
+    <w:p>
+      <w:pPr>
+        <w:pStyle w:val="10"/>
+        <w:keepNext w:val="0"/>
+        <w:keepLines w:val="0"/>
+        <w:pageBreakBefore w:val="0"/>
+        <w:widowControl/>
+        <w:suppressLineNumbers w:val="0"/>
+        <w:kinsoku/>
+        <w:wordWrap/>
+        <w:overflowPunct/>
+        <w:topLinePunct w:val="0"/>
+        <w:autoSpaceDE/>
+        <w:autoSpaceDN/>
+        <w:bidi w:val="0"/>
+        <w:adjustRightInd/>
+        <w:snapToGrid/>
+        <w:spacing w:before="0" w:beforeAutospacing="0" w:line="204" w:lineRule="auto"/>
+        <w:ind w:left="-1" w:leftChars="0" w:firstLine="0" w:firstLineChars="0"/>
+        <w:textAlignment w:val="auto"/>
+        <w:rPr>
+          <w:rFonts w:hint="default" w:ascii="Bahnschrift" w:hAnsi="Bahnschrift" w:cs="Bahnschrift"/>
+        </w:rPr>
+      </w:pPr>
+      <w:r>
+        <w:rPr>
+          <w:rStyle w:val="11"/>
+          <w:rFonts w:hint="default" w:ascii="Bahnschrift" w:hAnsi="Bahnschrift" w:cs="Bahnschrift"/>
+        </w:rPr>
+        <w:t>Agent:</w:t>
+      </w:r>
+      <w:r>
+        <w:rPr>
+          <w:rFonts w:hint="default" w:ascii="Bahnschrift" w:hAnsi="Bahnschrift" w:cs="Bahnschrift"/>
+        </w:rPr>
+        <w:t xml:space="preserve"> It </w:t>
+      </w:r>
+      <w:r>
+        <w:rPr>
+          <w:rStyle w:val="9"/>
+          <w:rFonts w:hint="default" w:ascii="Bahnschrift" w:hAnsi="Bahnschrift" w:cs="Bahnschrift"/>
+        </w:rPr>
+        <w:t>is</w:t>
+      </w:r>
+      <w:r>
+        <w:rPr>
+          <w:rFonts w:hint="default" w:ascii="Bahnschrift" w:hAnsi="Bahnschrift" w:cs="Bahnschrift"/>
+        </w:rPr>
+        <w:t xml:space="preserve"> your problem when the truth comes out. Fake stories don’t last forever. And when people realize they’ve been played, they’ll want someone to blame.</w:t>
+      </w:r>
+    </w:p>
+    <w:p>
+      <w:pPr>
+        <w:pStyle w:val="10"/>
+        <w:keepNext w:val="0"/>
+        <w:keepLines w:val="0"/>
+        <w:pageBreakBefore w:val="0"/>
+        <w:widowControl/>
+        <w:suppressLineNumbers w:val="0"/>
+        <w:kinsoku/>
+        <w:wordWrap/>
+        <w:overflowPunct/>
+        <w:topLinePunct w:val="0"/>
+        <w:autoSpaceDE/>
+        <w:autoSpaceDN/>
+        <w:bidi w:val="0"/>
+        <w:adjustRightInd/>
+        <w:snapToGrid/>
+        <w:spacing w:before="0" w:beforeAutospacing="0" w:line="204" w:lineRule="auto"/>
+        <w:ind w:left="-1" w:leftChars="0" w:firstLine="0" w:firstLineChars="0"/>
+        <w:textAlignment w:val="auto"/>
+        <w:rPr>
+          <w:rFonts w:hint="default" w:ascii="Bahnschrift" w:hAnsi="Bahnschrift" w:cs="Bahnschrift"/>
+        </w:rPr>
+      </w:pPr>
+      <w:r>
+        <w:rPr>
+          <w:rStyle w:val="11"/>
+          <w:rFonts w:hint="default" w:ascii="Bahnschrift" w:hAnsi="Bahnschrift" w:cs="Bahnschrift"/>
+        </w:rPr>
+        <w:t>Vince:</w:t>
+      </w:r>
+      <w:r>
+        <w:rPr>
+          <w:rFonts w:hint="default" w:ascii="Bahnschrift" w:hAnsi="Bahnschrift" w:cs="Bahnschrift"/>
+        </w:rPr>
+        <w:t xml:space="preserve"> …</w:t>
+      </w:r>
+    </w:p>
+    <w:p>
+      <w:pPr>
+        <w:pStyle w:val="10"/>
+        <w:keepNext w:val="0"/>
+        <w:keepLines w:val="0"/>
+        <w:pageBreakBefore w:val="0"/>
+        <w:widowControl/>
+        <w:suppressLineNumbers w:val="0"/>
+        <w:kinsoku/>
+        <w:wordWrap/>
+        <w:overflowPunct/>
+        <w:topLinePunct w:val="0"/>
+        <w:autoSpaceDE/>
+        <w:autoSpaceDN/>
+        <w:bidi w:val="0"/>
+        <w:adjustRightInd/>
+        <w:snapToGrid/>
+        <w:spacing w:before="0" w:beforeAutospacing="0" w:line="204" w:lineRule="auto"/>
+        <w:ind w:left="-1" w:leftChars="0" w:firstLine="0" w:firstLineChars="0"/>
+        <w:textAlignment w:val="auto"/>
+        <w:rPr>
+          <w:rFonts w:hint="default" w:ascii="Bahnschrift" w:hAnsi="Bahnschrift" w:cs="Bahnschrift"/>
+        </w:rPr>
+      </w:pPr>
+      <w:r>
+        <w:rPr>
+          <w:rStyle w:val="11"/>
+          <w:rFonts w:hint="default" w:ascii="Bahnschrift" w:hAnsi="Bahnschrift" w:cs="Bahnschrift"/>
+        </w:rPr>
+        <w:t>Agent:</w:t>
+      </w:r>
+      <w:r>
+        <w:rPr>
+          <w:rFonts w:hint="default" w:ascii="Bahnschrift" w:hAnsi="Bahnschrift" w:cs="Bahnschrift"/>
+        </w:rPr>
+        <w:t xml:space="preserve"> The Mayor? He’s protected. You? You’re disposable.</w:t>
+      </w:r>
+    </w:p>
+    <w:p>
+      <w:pPr>
+        <w:pStyle w:val="10"/>
+        <w:keepNext w:val="0"/>
+        <w:keepLines w:val="0"/>
+        <w:pageBreakBefore w:val="0"/>
+        <w:widowControl/>
+        <w:suppressLineNumbers w:val="0"/>
+        <w:kinsoku/>
+        <w:wordWrap/>
+        <w:overflowPunct/>
+        <w:topLinePunct w:val="0"/>
+        <w:autoSpaceDE/>
+        <w:autoSpaceDN/>
+        <w:bidi w:val="0"/>
+        <w:adjustRightInd/>
+        <w:snapToGrid/>
+        <w:spacing w:before="0" w:beforeAutospacing="0" w:line="204" w:lineRule="auto"/>
+        <w:ind w:left="-1" w:leftChars="0" w:firstLine="0" w:firstLineChars="0"/>
+        <w:textAlignment w:val="auto"/>
+        <w:rPr>
+          <w:rFonts w:hint="default" w:ascii="Bahnschrift" w:hAnsi="Bahnschrift" w:cs="Bahnschrift"/>
+        </w:rPr>
+      </w:pPr>
+      <w:r>
+        <w:rPr>
+          <w:rStyle w:val="11"/>
+          <w:rFonts w:hint="default" w:ascii="Bahnschrift" w:hAnsi="Bahnschrift" w:cs="Bahnschrift"/>
+        </w:rPr>
+        <w:t>Vince:</w:t>
+      </w:r>
+      <w:r>
+        <w:rPr>
+          <w:rFonts w:hint="default" w:ascii="Bahnschrift" w:hAnsi="Bahnschrift" w:cs="Bahnschrift"/>
+        </w:rPr>
+        <w:t xml:space="preserve"> …You think people will come after me?</w:t>
+      </w:r>
+    </w:p>
+    <w:p>
+      <w:pPr>
+        <w:pStyle w:val="10"/>
+        <w:keepNext w:val="0"/>
+        <w:keepLines w:val="0"/>
+        <w:pageBreakBefore w:val="0"/>
+        <w:widowControl/>
+        <w:suppressLineNumbers w:val="0"/>
+        <w:kinsoku/>
+        <w:wordWrap/>
+        <w:overflowPunct/>
+        <w:topLinePunct w:val="0"/>
+        <w:autoSpaceDE/>
+        <w:autoSpaceDN/>
+        <w:bidi w:val="0"/>
+        <w:adjustRightInd/>
+        <w:snapToGrid/>
+        <w:spacing w:before="0" w:beforeAutospacing="0" w:line="204" w:lineRule="auto"/>
+        <w:ind w:left="-1" w:leftChars="0" w:firstLine="0" w:firstLineChars="0"/>
+        <w:textAlignment w:val="auto"/>
+        <w:rPr>
+          <w:rFonts w:hint="default" w:ascii="Bahnschrift" w:hAnsi="Bahnschrift" w:cs="Bahnschrift"/>
+        </w:rPr>
+      </w:pPr>
+      <w:r>
+        <w:rPr>
+          <w:rStyle w:val="11"/>
+          <w:rFonts w:hint="default" w:ascii="Bahnschrift" w:hAnsi="Bahnschrift" w:cs="Bahnschrift"/>
+        </w:rPr>
+        <w:t>Agent:</w:t>
+      </w:r>
+      <w:r>
+        <w:rPr>
+          <w:rFonts w:hint="default" w:ascii="Bahnschrift" w:hAnsi="Bahnschrift" w:cs="Bahnschrift"/>
+        </w:rPr>
+        <w:t xml:space="preserve"> I </w:t>
+      </w:r>
+      <w:r>
+        <w:rPr>
+          <w:rStyle w:val="9"/>
+          <w:rFonts w:hint="default" w:ascii="Bahnschrift" w:hAnsi="Bahnschrift" w:cs="Bahnschrift"/>
+        </w:rPr>
+        <w:t>know</w:t>
+      </w:r>
+      <w:r>
+        <w:rPr>
+          <w:rFonts w:hint="default" w:ascii="Bahnschrift" w:hAnsi="Bahnschrift" w:cs="Bahnschrift"/>
+        </w:rPr>
+        <w:t xml:space="preserve"> they will. And once you lose credibility, you don’t get it back.</w:t>
+      </w:r>
+    </w:p>
+    <w:p>
+      <w:pPr>
+        <w:pStyle w:val="10"/>
+        <w:keepNext w:val="0"/>
+        <w:keepLines w:val="0"/>
+        <w:pageBreakBefore w:val="0"/>
+        <w:widowControl/>
+        <w:suppressLineNumbers w:val="0"/>
+        <w:kinsoku/>
+        <w:wordWrap/>
+        <w:overflowPunct/>
+        <w:topLinePunct w:val="0"/>
+        <w:autoSpaceDE/>
+        <w:autoSpaceDN/>
+        <w:bidi w:val="0"/>
+        <w:adjustRightInd/>
+        <w:snapToGrid/>
+        <w:spacing w:before="0" w:beforeAutospacing="0" w:line="204" w:lineRule="auto"/>
+        <w:ind w:left="-1" w:leftChars="0" w:firstLine="0" w:firstLineChars="0"/>
+        <w:textAlignment w:val="auto"/>
+        <w:rPr>
+          <w:rFonts w:hint="default" w:ascii="Bahnschrift" w:hAnsi="Bahnschrift" w:cs="Bahnschrift"/>
+        </w:rPr>
+      </w:pPr>
+      <w:r>
+        <w:rPr>
+          <w:rStyle w:val="11"/>
+          <w:rFonts w:hint="default" w:ascii="Bahnschrift" w:hAnsi="Bahnschrift" w:cs="Bahnschrift"/>
+        </w:rPr>
+        <w:t>Vince:</w:t>
+      </w:r>
+      <w:r>
+        <w:rPr>
+          <w:rFonts w:hint="default" w:ascii="Bahnschrift" w:hAnsi="Bahnschrift" w:cs="Bahnschrift"/>
+        </w:rPr>
+        <w:t xml:space="preserve"> …Tch. Maybe I’ll chill for a while. But don’t think I’m suddenly all about the truth.</w:t>
+      </w:r>
+    </w:p>
+    <w:p>
+      <w:pPr>
+        <w:pStyle w:val="10"/>
+        <w:keepNext w:val="0"/>
+        <w:keepLines w:val="0"/>
+        <w:pageBreakBefore w:val="0"/>
+        <w:widowControl/>
+        <w:suppressLineNumbers w:val="0"/>
+        <w:kinsoku/>
+        <w:wordWrap/>
+        <w:overflowPunct/>
+        <w:topLinePunct w:val="0"/>
+        <w:autoSpaceDE/>
+        <w:autoSpaceDN/>
+        <w:bidi w:val="0"/>
+        <w:adjustRightInd/>
+        <w:snapToGrid/>
+        <w:spacing w:before="0" w:beforeAutospacing="0" w:line="204" w:lineRule="auto"/>
+        <w:ind w:left="-1" w:leftChars="0" w:firstLine="0" w:firstLineChars="0"/>
+        <w:textAlignment w:val="auto"/>
+        <w:rPr>
+          <w:rFonts w:hint="default" w:ascii="Bahnschrift" w:hAnsi="Bahnschrift" w:cs="Bahnschrift"/>
+          <w:lang w:val="en-US"/>
+        </w:rPr>
+      </w:pPr>
+      <w:r>
+        <w:rPr>
+          <w:rStyle w:val="11"/>
+          <w:rFonts w:hint="default" w:ascii="Bahnschrift" w:hAnsi="Bahnschrift" w:cs="Bahnschrift"/>
+        </w:rPr>
+        <w:t>Agent:</w:t>
+      </w:r>
+      <w:r>
+        <w:rPr>
+          <w:rFonts w:hint="default" w:ascii="Bahnschrift" w:hAnsi="Bahnschrift" w:cs="Bahnschrift"/>
+        </w:rPr>
+        <w:t xml:space="preserve"> Didn’t ask you to be. Just asked you to </w:t>
+      </w:r>
+      <w:r>
+        <w:rPr>
+          <w:rStyle w:val="9"/>
+          <w:rFonts w:hint="default" w:ascii="Bahnschrift" w:hAnsi="Bahnschrift" w:cs="Bahnschrift"/>
+        </w:rPr>
+        <w:t>think</w:t>
+      </w:r>
+      <w:r>
+        <w:rPr>
+          <w:rFonts w:hint="default" w:ascii="Bahnschrift" w:hAnsi="Bahnschrift" w:cs="Bahnschrift"/>
+        </w:rPr>
+        <w:t>.</w:t>
       </w:r>
     </w:p>
     <w:p>
@@ -2798,7 +5079,7 @@
           <w:rFonts w:hint="default" w:ascii="Bahnschrift" w:hAnsi="Bahnschrift" w:cs="Bahnschrift"/>
           <w:lang w:val="en-US"/>
         </w:rPr>
-        <w:t xml:space="preserve"> in a crowd locate and arrest/defeat agents of the mayor that have been sent to spread disinformation in a campain ground, find clues for locating the teleporter back home</w:t>
+        <w:t xml:space="preserve"> in a little crowd locate and arrest/defeat agents of the mayor that have been sent to spread disinformation in a campaign ground, find clues for locating the teleporter back home</w:t>
       </w:r>
     </w:p>
     <w:p>
@@ -2881,7 +5162,7 @@
           <w:rFonts w:hint="default" w:ascii="Bahnschrift" w:hAnsi="Bahnschrift" w:cs="Bahnschrift"/>
           <w:lang w:val="en-US"/>
         </w:rPr>
-        <w:t>sneak and find the agents of the mayor and arrestthem</w:t>
+        <w:t>sneak and find the agents of the mayor and arrest them</w:t>
       </w:r>
     </w:p>
     <w:p>
@@ -2929,7 +5210,7 @@
           <w:rFonts w:hint="default" w:ascii="Bahnschrift" w:hAnsi="Bahnschrift" w:cs="Bahnschrift"/>
           <w:lang w:val="en-US"/>
         </w:rPr>
-        <w:t>find the agnets and the machine taking you back to base</w:t>
+        <w:t>find the agents and the machine taking you back to base</w:t>
       </w:r>
     </w:p>
     <w:p>
@@ -3954,6 +6235,185 @@
           <w:lang w:val="en-US"/>
         </w:rPr>
       </w:pPr>
+      <w:r>
+        <w:rPr>
+          <w:rFonts w:hint="default" w:ascii="Bahnschrift" w:hAnsi="Bahnschrift" w:cs="Bahnschrift"/>
+          <w:b w:val="0"/>
+          <w:bCs w:val="0"/>
+          <w:u w:val="none"/>
+          <w:lang w:val="en-US"/>
+        </w:rPr>
+        <w:t>Player name: Agent Damian</w:t>
+      </w:r>
+    </w:p>
+    <w:p>
+      <w:pPr>
+        <w:rPr>
+          <w:rFonts w:hint="default" w:ascii="Bahnschrift" w:hAnsi="Bahnschrift" w:cs="Bahnschrift"/>
+          <w:b w:val="0"/>
+          <w:bCs w:val="0"/>
+          <w:u w:val="none"/>
+          <w:lang w:val="en-US"/>
+        </w:rPr>
+      </w:pPr>
+      <w:r>
+        <w:rPr>
+          <w:rFonts w:hint="default" w:ascii="Bahnschrift" w:hAnsi="Bahnschrift" w:cs="Bahnschrift"/>
+          <w:b w:val="0"/>
+          <w:bCs w:val="0"/>
+          <w:u w:val="none"/>
+          <w:lang w:val="en-US"/>
+        </w:rPr>
+        <w:t>Boss Name: MastaMindd (fka. )</w:t>
+      </w:r>
+    </w:p>
+    <w:p>
+      <w:pPr>
+        <w:rPr>
+          <w:rFonts w:hint="default" w:ascii="Bahnschrift" w:hAnsi="Bahnschrift" w:cs="Bahnschrift"/>
+          <w:b w:val="0"/>
+          <w:bCs w:val="0"/>
+          <w:u w:val="none"/>
+          <w:lang w:val="en-US"/>
+        </w:rPr>
+      </w:pPr>
+    </w:p>
+    <w:p>
+      <w:pPr>
+        <w:rPr>
+          <w:rFonts w:hint="default" w:ascii="Bahnschrift" w:hAnsi="Bahnschrift" w:cs="Bahnschrift"/>
+          <w:b w:val="0"/>
+          <w:bCs w:val="0"/>
+          <w:u w:val="none"/>
+          <w:lang w:val="en-US"/>
+        </w:rPr>
+      </w:pPr>
+      <w:r>
+        <w:rPr>
+          <w:rFonts w:hint="default" w:ascii="Bahnschrift" w:hAnsi="Bahnschrift" w:cs="Bahnschrift"/>
+          <w:b w:val="0"/>
+          <w:bCs w:val="0"/>
+          <w:u w:val="none"/>
+          <w:lang w:val="en-US"/>
+        </w:rPr>
+        <w:t>FOR THE CITY LEVEL:</w:t>
+      </w:r>
+    </w:p>
+    <w:p>
+      <w:pPr>
+        <w:rPr>
+          <w:rFonts w:hint="default" w:ascii="Bahnschrift" w:hAnsi="Bahnschrift" w:cs="Bahnschrift"/>
+          <w:b w:val="0"/>
+          <w:bCs w:val="0"/>
+          <w:u w:val="none"/>
+          <w:lang w:val="en-US"/>
+        </w:rPr>
+      </w:pPr>
+      <w:r>
+        <w:rPr>
+          <w:rFonts w:hint="default" w:ascii="Bahnschrift" w:hAnsi="Bahnschrift" w:cs="Bahnschrift"/>
+          <w:b w:val="0"/>
+          <w:bCs w:val="0"/>
+          <w:u w:val="none"/>
+          <w:lang w:val="en-US"/>
+        </w:rPr>
+        <w:t>Island Name: Tropicalla Island</w:t>
+      </w:r>
+    </w:p>
+    <w:p>
+      <w:pPr>
+        <w:rPr>
+          <w:rFonts w:hint="default" w:ascii="Bahnschrift" w:hAnsi="Bahnschrift" w:cs="Bahnschrift"/>
+          <w:b w:val="0"/>
+          <w:bCs w:val="0"/>
+          <w:u w:val="none"/>
+          <w:lang w:val="en-US"/>
+        </w:rPr>
+      </w:pPr>
+    </w:p>
+    <w:p>
+      <w:pPr>
+        <w:rPr>
+          <w:rFonts w:hint="default" w:ascii="Bahnschrift" w:hAnsi="Bahnschrift" w:cs="Bahnschrift"/>
+          <w:b w:val="0"/>
+          <w:bCs w:val="0"/>
+          <w:u w:val="none"/>
+          <w:lang w:val="en-US"/>
+        </w:rPr>
+      </w:pPr>
+      <w:r>
+        <w:rPr>
+          <w:rFonts w:hint="default" w:ascii="Bahnschrift" w:hAnsi="Bahnschrift" w:cs="Bahnschrift"/>
+          <w:b w:val="0"/>
+          <w:bCs w:val="0"/>
+          <w:u w:val="none"/>
+          <w:lang w:val="en-US"/>
+        </w:rPr>
+        <w:t>Number of NPC’s = 15 (only 3 to talk to for the machine)</w:t>
+      </w:r>
+    </w:p>
+    <w:p>
+      <w:pPr>
+        <w:rPr>
+          <w:rFonts w:hint="default" w:ascii="Bahnschrift" w:hAnsi="Bahnschrift" w:cs="Bahnschrift"/>
+          <w:b w:val="0"/>
+          <w:bCs w:val="0"/>
+          <w:u w:val="none"/>
+          <w:lang w:val="en-US"/>
+        </w:rPr>
+      </w:pPr>
+      <w:r>
+        <w:rPr>
+          <w:rFonts w:hint="default" w:ascii="Bahnschrift" w:hAnsi="Bahnschrift" w:cs="Bahnschrift"/>
+          <w:b w:val="0"/>
+          <w:bCs w:val="0"/>
+          <w:u w:val="none"/>
+          <w:lang w:val="en-US"/>
+        </w:rPr>
+        <w:t>NPC1 - Bob: Was paid by the Mayor to spread disinformation, hasn’t actually started the work because he doesn’t feel good about it, have to talk to him about it</w:t>
+      </w:r>
+    </w:p>
+    <w:p>
+      <w:pPr>
+        <w:rPr>
+          <w:rFonts w:hint="default" w:ascii="Bahnschrift" w:hAnsi="Bahnschrift" w:cs="Bahnschrift"/>
+          <w:b w:val="0"/>
+          <w:bCs w:val="0"/>
+          <w:u w:val="none"/>
+          <w:lang w:val="en-US"/>
+        </w:rPr>
+      </w:pPr>
+      <w:r>
+        <w:rPr>
+          <w:rFonts w:hint="default" w:ascii="Bahnschrift" w:hAnsi="Bahnschrift" w:cs="Bahnschrift"/>
+          <w:b w:val="0"/>
+          <w:bCs w:val="0"/>
+          <w:u w:val="none"/>
+          <w:lang w:val="en-US"/>
+        </w:rPr>
+        <w:t>NPC2 - Samantha: Has been misinformed, need to talk to her about it and convince her its not true</w:t>
+      </w:r>
+    </w:p>
+    <w:p>
+      <w:pPr>
+        <w:rPr>
+          <w:rFonts w:hint="default" w:ascii="Bahnschrift" w:hAnsi="Bahnschrift" w:cs="Bahnschrift"/>
+          <w:b w:val="0"/>
+          <w:bCs w:val="0"/>
+          <w:u w:val="none"/>
+          <w:lang w:val="en-US"/>
+        </w:rPr>
+      </w:pPr>
+      <w:r>
+        <w:rPr>
+          <w:rFonts w:hint="default" w:ascii="Bahnschrift" w:hAnsi="Bahnschrift" w:cs="Bahnschrift"/>
+          <w:b w:val="0"/>
+          <w:bCs w:val="0"/>
+          <w:u w:val="none"/>
+          <w:lang w:val="en-US"/>
+        </w:rPr>
+        <w:t>NPC3 - Vince: a supporter of the mayor, doesn’t mind spreading dis/misinformation, have to convince him not to</w:t>
+      </w:r>
     </w:p>
     <w:p>
       <w:pPr>
@@ -3972,7 +6432,114 @@
           <w:rFonts w:hint="default" w:ascii="Bahnschrift" w:hAnsi="Bahnschrift" w:cs="Bahnschrift"/>
           <w:b w:val="0"/>
           <w:bCs w:val="0"/>
-          <w:u w:val="thick"/>
+          <w:u w:val="none"/>
+          <w:lang w:val="en-US"/>
+        </w:rPr>
+      </w:pPr>
+      <w:r>
+        <w:rPr>
+          <w:rFonts w:hint="default" w:ascii="Bahnschrift" w:hAnsi="Bahnschrift" w:cs="Bahnschrift"/>
+          <w:b w:val="0"/>
+          <w:bCs w:val="0"/>
+          <w:u w:val="none"/>
+          <w:lang w:val="en-US"/>
+        </w:rPr>
+        <w:t>For the AI autonomy we will give multiple choice answers to the NPC’s question that will influence the dialogue:</w:t>
+      </w:r>
+    </w:p>
+    <w:p>
+      <w:pPr>
+        <w:rPr>
+          <w:rFonts w:hint="default" w:ascii="Bahnschrift" w:hAnsi="Bahnschrift" w:cs="Bahnschrift"/>
+          <w:b w:val="0"/>
+          <w:bCs w:val="0"/>
+          <w:u w:val="none"/>
+          <w:lang w:val="en-US"/>
+        </w:rPr>
+      </w:pPr>
+      <w:r>
+        <w:rPr>
+          <w:rFonts w:hint="default" w:ascii="Bahnschrift" w:hAnsi="Bahnschrift" w:cs="Bahnschrift"/>
+          <w:b w:val="0"/>
+          <w:bCs w:val="0"/>
+          <w:u w:val="none"/>
+          <w:lang w:val="en-US"/>
+        </w:rPr>
+        <w:t>- Complacent answers</w:t>
+      </w:r>
+    </w:p>
+    <w:p>
+      <w:pPr>
+        <w:rPr>
+          <w:rFonts w:hint="default" w:ascii="Bahnschrift" w:hAnsi="Bahnschrift" w:cs="Bahnschrift"/>
+          <w:b w:val="0"/>
+          <w:bCs w:val="0"/>
+          <w:u w:val="none"/>
+          <w:lang w:val="en-US"/>
+        </w:rPr>
+      </w:pPr>
+      <w:r>
+        <w:rPr>
+          <w:rFonts w:hint="default" w:ascii="Bahnschrift" w:hAnsi="Bahnschrift" w:cs="Bahnschrift"/>
+          <w:b w:val="0"/>
+          <w:bCs w:val="0"/>
+          <w:u w:val="none"/>
+          <w:lang w:val="en-US"/>
+        </w:rPr>
+        <w:t>- aggressive answers</w:t>
+      </w:r>
+    </w:p>
+    <w:p>
+      <w:pPr>
+        <w:rPr>
+          <w:rFonts w:hint="default" w:ascii="Bahnschrift" w:hAnsi="Bahnschrift" w:cs="Bahnschrift"/>
+          <w:b w:val="0"/>
+          <w:bCs w:val="0"/>
+          <w:u w:val="none"/>
+          <w:lang w:val="en-US"/>
+        </w:rPr>
+      </w:pPr>
+      <w:r>
+        <w:rPr>
+          <w:rFonts w:hint="default" w:ascii="Bahnschrift" w:hAnsi="Bahnschrift" w:cs="Bahnschrift"/>
+          <w:b w:val="0"/>
+          <w:bCs w:val="0"/>
+          <w:u w:val="none"/>
+          <w:lang w:val="en-US"/>
+        </w:rPr>
+        <w:t>- calm answers</w:t>
+      </w:r>
+    </w:p>
+    <w:p>
+      <w:pPr>
+        <w:rPr>
+          <w:rFonts w:hint="default" w:ascii="Bahnschrift" w:hAnsi="Bahnschrift" w:cs="Bahnschrift"/>
+          <w:b w:val="0"/>
+          <w:bCs w:val="0"/>
+          <w:u w:val="none"/>
+          <w:lang w:val="en-US"/>
+        </w:rPr>
+      </w:pPr>
+      <w:r>
+        <w:rPr>
+          <w:rFonts w:hint="default" w:ascii="Bahnschrift" w:hAnsi="Bahnschrift" w:cs="Bahnschrift"/>
+          <w:b w:val="0"/>
+          <w:bCs w:val="0"/>
+          <w:u w:val="none"/>
+          <w:lang w:val="en-US"/>
+        </w:rPr>
+        <w:t>- calculated answers</w:t>
+      </w:r>
+      <w:bookmarkStart w:id="0" w:name="_GoBack"/>
+      <w:bookmarkEnd w:id="0"/>
+    </w:p>
+    <w:p>
+      <w:pPr>
+        <w:rPr>
+          <w:rFonts w:hint="default" w:ascii="Bahnschrift" w:hAnsi="Bahnschrift" w:cs="Bahnschrift"/>
+          <w:b w:val="0"/>
+          <w:bCs w:val="0"/>
+          <w:u w:val="none"/>
           <w:lang w:val="en-US"/>
         </w:rPr>
       </w:pPr>

</xml_diff>

<commit_message>
Redo UI, Modify Docs
</commit_message>
<xml_diff>
--- a/Assets/Documentation/AGENT INFO GAME DOCUMENTATION.docx
+++ b/Assets/Documentation/AGENT INFO GAME DOCUMENTATION.docx
@@ -6530,8 +6530,6 @@
         </w:rPr>
         <w:t>- calculated answers</w:t>
       </w:r>
-      <w:bookmarkStart w:id="0" w:name="_GoBack"/>
-      <w:bookmarkEnd w:id="0"/>
     </w:p>
     <w:p>
       <w:pPr>
@@ -7532,7 +7530,7 @@
           <wp:inline distT="0" distB="0" distL="114300" distR="114300">
             <wp:extent cx="3265170" cy="2133600"/>
             <wp:effectExtent l="0" t="0" r="11430" b="0"/>
-            <wp:docPr id="4" name="Picture 4" descr="minigame-menu-mockup"/>
+            <wp:docPr id="4" name="Picture 4" descr="C:\Users\M O N S U R O H\Desktop\Unity Projects\Disinformation-Agent-Info\Assets\Documentation\minigame-menu-mockup.pngminigame-menu-mockup"/>
             <wp:cNvGraphicFramePr>
               <a:graphicFrameLocks xmlns:a="http://schemas.openxmlformats.org/drawingml/2006/main" noChangeAspect="1"/>
             </wp:cNvGraphicFramePr>
@@ -7540,13 +7538,14 @@
               <a:graphicData uri="http://schemas.openxmlformats.org/drawingml/2006/picture">
                 <pic:pic xmlns:pic="http://schemas.openxmlformats.org/drawingml/2006/picture">
                   <pic:nvPicPr>
-                    <pic:cNvPr id="4" name="Picture 4" descr="minigame-menu-mockup"/>
+                    <pic:cNvPr id="4" name="Picture 4" descr="C:\Users\M O N S U R O H\Desktop\Unity Projects\Disinformation-Agent-Info\Assets\Documentation\minigame-menu-mockup.pngminigame-menu-mockup"/>
                     <pic:cNvPicPr>
                       <a:picLocks noChangeAspect="1"/>
                     </pic:cNvPicPr>
                   </pic:nvPicPr>
                   <pic:blipFill>
                     <a:blip r:embed="rId7"/>
+                    <a:srcRect l="15" r="15"/>
                     <a:stretch>
                       <a:fillRect/>
                     </a:stretch>
@@ -7605,7 +7604,7 @@
           <w:rFonts w:hint="default" w:ascii="Bahnschrift" w:hAnsi="Bahnschrift" w:cs="Bahnschrift"/>
           <w:lang w:val="en-US"/>
         </w:rPr>
-        <w:t>The right side bar will have a list of the unlocked missions and their keys in case the player wants to go back and replay that level</w:t>
+        <w:t>The rank will have a n icon and text showing the rank of the player</w:t>
       </w:r>
     </w:p>
     <w:p>
@@ -7621,6 +7620,22 @@
           <w:rFonts w:hint="default" w:ascii="Bahnschrift" w:hAnsi="Bahnschrift" w:cs="Bahnschrift"/>
           <w:lang w:val="en-US"/>
         </w:rPr>
+        <w:t>Te mission code will show “---” if the gae hasn’t be completed and sow the code if it has been</w:t>
+      </w:r>
+    </w:p>
+    <w:p>
+      <w:pPr>
+        <w:jc w:val="left"/>
+        <w:rPr>
+          <w:rFonts w:hint="default" w:ascii="Bahnschrift" w:hAnsi="Bahnschrift" w:cs="Bahnschrift"/>
+          <w:lang w:val="en-US"/>
+        </w:rPr>
+      </w:pPr>
+      <w:r>
+        <w:rPr>
+          <w:rFonts w:hint="default" w:ascii="Bahnschrift" w:hAnsi="Bahnschrift" w:cs="Bahnschrift"/>
+          <w:lang w:val="en-US"/>
+        </w:rPr>
         <w:t>The main panel will contain buttons of the mini games that are available or that should be  played to unlock te level</w:t>
       </w:r>
     </w:p>
@@ -7637,8 +7652,10 @@
           <w:rFonts w:hint="default" w:ascii="Bahnschrift" w:hAnsi="Bahnschrift" w:cs="Bahnschrift"/>
           <w:lang w:val="en-US"/>
         </w:rPr>
-        <w:t>Then the quit buton lol</w:t>
-      </w:r>
+        <w:t>Then the quit buton exits the menu</w:t>
+      </w:r>
+      <w:bookmarkStart w:id="0" w:name="_GoBack"/>
+      <w:bookmarkEnd w:id="0"/>
     </w:p>
     <w:p>
       <w:pPr>
@@ -8081,7 +8098,7 @@
     </w:p>
     <w:sectPr>
       <w:pgSz w:w="11906" w:h="16838"/>
-      <w:pgMar w:top="440" w:right="306" w:bottom="398" w:left="400" w:header="720" w:footer="720" w:gutter="0"/>
+      <w:pgMar w:top="446" w:right="302" w:bottom="403" w:left="403" w:header="720" w:footer="720" w:gutter="0"/>
       <w:cols w:space="720" w:num="1"/>
       <w:docGrid w:linePitch="360" w:charSpace="0"/>
     </w:sectPr>

</xml_diff>

<commit_message>
New Additions and Bug Fixes
</commit_message>
<xml_diff>
--- a/Assets/Documentation/AGENT INFO GAME DOCUMENTATION.docx
+++ b/Assets/Documentation/AGENT INFO GAME DOCUMENTATION.docx
@@ -1344,6 +1344,7 @@
           <w:rFonts w:hint="default" w:ascii="Bahnschrift" w:hAnsi="Bahnschrift" w:cs="Bahnschrift"/>
         </w:rPr>
       </w:pPr>
+      <w:bookmarkStart w:id="0" w:name="_GoBack"/>
       <w:r>
         <w:rPr>
           <w:rStyle w:val="11"/>
@@ -1942,6 +1943,7 @@
         <w:t xml:space="preserve"> Hah. Never thought I’d say this, but thanks.</w:t>
       </w:r>
     </w:p>
+    <w:bookmarkEnd w:id="0"/>
     <w:p>
       <w:pPr>
         <w:keepNext w:val="0"/>
@@ -6530,8 +6532,6 @@
         </w:rPr>
         <w:t>- calculated answers</w:t>
       </w:r>
-      <w:bookmarkStart w:id="0" w:name="_GoBack"/>
-      <w:bookmarkEnd w:id="0"/>
     </w:p>
     <w:p>
       <w:pPr>

</xml_diff>